<commit_message>
Pin reproducible IsaacLab and Instinct-RL dependencies
</commit_message>
<xml_diff>
--- a/docs/FOOTHOLD_PROJECT_HANDOVER_PERSONAL.docx
+++ b/docs/FOOTHOLD_PROJECT_HANDOVER_PERSONAL.docx
@@ -2252,7 +2252,7 @@
         <w:rPr>
           <w:rStyle w:val="StrongEmphasis"/>
         </w:rPr>
-        <w:t xml:space="preserve">没有复制或修改外部 </w:t>
+        <w:t xml:space="preserve">没有复制或修改 </w:t>
       </w:r>
       <w:r>
         <w:rPr>
@@ -2268,7 +2268,45 @@
       </w:r>
       <w:r>
         <w:rPr/>
-        <w:t xml:space="preserve">。对网络和 </w:t>
+        <w:t>。</w:t>
+      </w:r>
+      <w:r>
+        <w:rPr/>
+        <w:t xml:space="preserve">IsaacLab </w:t>
+      </w:r>
+      <w:r>
+        <w:rPr/>
+        <w:t xml:space="preserve">与 </w:t>
+      </w:r>
+      <w:r>
+        <w:rPr/>
+        <w:t xml:space="preserve">Instinct-RL </w:t>
+      </w:r>
+      <w:r>
+        <w:rPr/>
+        <w:t xml:space="preserve">源码现在通过 </w:t>
+      </w:r>
+      <w:r>
+        <w:rPr>
+          <w:rStyle w:val="SourceText"/>
+        </w:rPr>
+        <w:t>third_party/</w:t>
+      </w:r>
+      <w:r>
+        <w:rPr/>
+        <w:t xml:space="preserve"> </w:t>
+      </w:r>
+      <w:r>
+        <w:rPr/>
+        <w:t xml:space="preserve">下的 </w:t>
+      </w:r>
+      <w:r>
+        <w:rPr/>
+        <w:t xml:space="preserve">Git submodule </w:t>
+      </w:r>
+      <w:r>
+        <w:rPr/>
+        <w:t xml:space="preserve">固定版本；对网络和 </w:t>
       </w:r>
       <w:r>
         <w:rPr/>
@@ -2276,7 +2314,7 @@
       </w:r>
       <w:r>
         <w:rPr/>
-        <w:t xml:space="preserve">的扩展都放在本项目的 </w:t>
+        <w:t xml:space="preserve">的扩展仍全部放在本项目的 </w:t>
       </w:r>
       <w:r>
         <w:rPr>
@@ -2290,11 +2328,11 @@
       </w:r>
       <w:r>
         <w:rPr/>
-        <w:t xml:space="preserve">下，通过配置动态注册和调用外部包接口。因此，新电脑除了克隆本仓库，还必须安装匹配版本的 </w:t>
-      </w:r>
-      <w:r>
-        <w:rPr/>
-        <w:t>IsaacLab</w:t>
+        <w:t xml:space="preserve">下。新电脑使用递归克隆即可取得两份源码，但仍必须单独准备 </w:t>
+      </w:r>
+      <w:r>
+        <w:rPr/>
+        <w:t>Isaac Sim</w:t>
       </w:r>
       <w:r>
         <w:rPr/>
@@ -2302,19 +2340,11 @@
       </w:r>
       <w:r>
         <w:rPr/>
-        <w:t xml:space="preserve">Isaac Sim </w:t>
-      </w:r>
-      <w:r>
-        <w:rPr/>
-        <w:t xml:space="preserve">和 </w:t>
-      </w:r>
-      <w:r>
-        <w:rPr/>
-        <w:t>Instinct-RL</w:t>
-      </w:r>
-      <w:r>
-        <w:rPr/>
-        <w:t>。</w:t>
+        <w:t xml:space="preserve">Python/CUDA </w:t>
+      </w:r>
+      <w:r>
+        <w:rPr/>
+        <w:t>环境和运动数据。</w:t>
       </w:r>
     </w:p>
     <w:p>
@@ -2379,7 +2409,7 @@
                     </pic:cNvPicPr>
                   </pic:nvPicPr>
                   <pic:blipFill>
-                    <a:blip r:embed="rId2"/>
+                    <a:blip r:link="rId2"/>
                     <a:stretch>
                       <a:fillRect/>
                     </a:stretch>
@@ -3036,7 +3066,7 @@
                     </pic:cNvPicPr>
                   </pic:nvPicPr>
                   <pic:blipFill>
-                    <a:blip r:embed="rId3"/>
+                    <a:blip r:link="rId3"/>
                     <a:stretch>
                       <a:fillRect/>
                     </a:stretch>
@@ -3864,7 +3894,7 @@
                     </pic:cNvPicPr>
                   </pic:nvPicPr>
                   <pic:blipFill>
-                    <a:blip r:embed="rId4"/>
+                    <a:blip r:link="rId4"/>
                     <a:stretch>
                       <a:fillRect/>
                     </a:stretch>
@@ -11701,13 +11731,23 @@
       </w:r>
       <w:r>
         <w:rPr/>
-        <w:t>提交：</w:t>
+        <w:t>子模块：</w:t>
       </w:r>
       <w:r>
         <w:rPr>
           <w:rStyle w:val="SourceText"/>
         </w:rPr>
-        <w:t>f73c331738</w:t>
+        <w:t>third_party/IsaacLab</w:t>
+      </w:r>
+      <w:r>
+        <w:rPr/>
+        <w:t xml:space="preserve">，提交 </w:t>
+      </w:r>
+      <w:r>
+        <w:rPr>
+          <w:rStyle w:val="SourceText"/>
+        </w:rPr>
+        <w:t>f73c33173801f5f8afea4142482e47b7710c2b75</w:t>
       </w:r>
       <w:r>
         <w:rPr/>
@@ -11733,15 +11773,21 @@
       </w:pPr>
       <w:r>
         <w:rPr/>
-        <w:t xml:space="preserve">外部 </w:t>
-      </w:r>
-      <w:r>
-        <w:rPr/>
         <w:t xml:space="preserve">Instinct-RL </w:t>
       </w:r>
       <w:r>
         <w:rPr/>
-        <w:t>提交：</w:t>
+        <w:t>子模块：</w:t>
+      </w:r>
+      <w:r>
+        <w:rPr>
+          <w:rStyle w:val="SourceText"/>
+        </w:rPr>
+        <w:t>third_party/instinct_rl</w:t>
+      </w:r>
+      <w:r>
+        <w:rPr/>
+        <w:t xml:space="preserve">，提交 </w:t>
       </w:r>
       <w:r>
         <w:rPr>
@@ -11877,7 +11923,7 @@
       </w:pPr>
       <w:r>
         <w:rPr/>
-        <w:t>git clone --branch feat/foothold-01-flat-tracking \</w:t>
+        <w:t>git clone --recurse-submodules \</w:t>
       </w:r>
     </w:p>
     <w:p>
@@ -11896,7 +11942,7 @@
       </w:r>
       <w:r>
         <w:rPr/>
-        <w:t>git@github.com:wbZ-123/InstinctLab.git InstinctLab-foothold</w:t>
+        <w:t>--branch feat/foothold-01-flat-tracking \</w:t>
       </w:r>
     </w:p>
     <w:p>
@@ -11911,6 +11957,25 @@
       </w:pPr>
       <w:r>
         <w:rPr/>
+        <w:t xml:space="preserve">  </w:t>
+      </w:r>
+      <w:r>
+        <w:rPr/>
+        <w:t>git@github.com:wbZ-123/InstinctLab.git InstinctLab-foothold</w:t>
+      </w:r>
+    </w:p>
+    <w:p>
+      <w:pPr>
+        <w:pStyle w:val="PreformattedText"/>
+        <w:keepLines/>
+        <w:shd w:val="clear" w:fill="111827"/>
+        <w:bidi w:val="0"/>
+        <w:spacing w:lineRule="auto" w:line="338" w:before="0" w:after="0"/>
+        <w:jc w:val="start"/>
+        <w:rPr/>
+      </w:pPr>
+      <w:r>
+        <w:rPr/>
         <w:t>cd InstinctLab-foothold</w:t>
       </w:r>
     </w:p>
@@ -11925,6 +11990,225 @@
       <w:r>
         <w:rPr/>
         <w:t>git log -1 --oneline</w:t>
+      </w:r>
+    </w:p>
+    <w:p>
+      <w:pPr>
+        <w:pStyle w:val="TextBody"/>
+        <w:bidi w:val="0"/>
+        <w:spacing w:before="90" w:after="135"/>
+        <w:ind w:start="90" w:end="90" w:hanging="0"/>
+        <w:jc w:val="start"/>
+        <w:rPr/>
+      </w:pPr>
+      <w:r>
+        <w:rPr/>
+        <w:t>如果已经用普通方式克隆：</w:t>
+      </w:r>
+    </w:p>
+    <w:p>
+      <w:pPr>
+        <w:pStyle w:val="PreformattedText"/>
+        <w:bidi w:val="0"/>
+        <w:spacing w:before="0" w:after="283"/>
+        <w:jc w:val="start"/>
+        <w:rPr/>
+      </w:pPr>
+      <w:r>
+        <w:rPr/>
+        <w:t>git submodule update --init --recursive</w:t>
+      </w:r>
+    </w:p>
+    <w:p>
+      <w:pPr>
+        <w:pStyle w:val="TextBody"/>
+        <w:bidi w:val="0"/>
+        <w:spacing w:before="90" w:after="135"/>
+        <w:ind w:start="90" w:end="90" w:hanging="0"/>
+        <w:jc w:val="start"/>
+        <w:rPr/>
+      </w:pPr>
+      <w:r>
+        <w:rPr/>
+        <w:t xml:space="preserve">源码子模块不等于完整运行环境。以下内容不会随 </w:t>
+      </w:r>
+      <w:r>
+        <w:rPr/>
+        <w:t xml:space="preserve">Git </w:t>
+      </w:r>
+      <w:r>
+        <w:rPr/>
+        <w:t>下载：</w:t>
+      </w:r>
+    </w:p>
+    <w:p>
+      <w:pPr>
+        <w:pStyle w:val="TextBody"/>
+        <w:numPr>
+          <w:ilvl w:val="0"/>
+          <w:numId w:val="26"/>
+        </w:numPr>
+        <w:tabs>
+          <w:tab w:val="clear" w:pos="1134"/>
+          <w:tab w:val="left" w:pos="799" w:leader="none"/>
+        </w:tabs>
+        <w:bidi w:val="0"/>
+        <w:spacing w:before="90" w:after="0"/>
+        <w:ind w:start="799" w:end="90" w:hanging="283"/>
+        <w:jc w:val="start"/>
+        <w:rPr/>
+      </w:pPr>
+      <w:r>
+        <w:rPr/>
+        <w:t>Isaac Sim 5.1</w:t>
+      </w:r>
+      <w:r>
+        <w:rPr/>
+        <w:t xml:space="preserve">； </w:t>
+      </w:r>
+    </w:p>
+    <w:p>
+      <w:pPr>
+        <w:pStyle w:val="TextBody"/>
+        <w:numPr>
+          <w:ilvl w:val="0"/>
+          <w:numId w:val="26"/>
+        </w:numPr>
+        <w:tabs>
+          <w:tab w:val="clear" w:pos="1134"/>
+          <w:tab w:val="left" w:pos="799" w:leader="none"/>
+        </w:tabs>
+        <w:bidi w:val="0"/>
+        <w:spacing w:before="90" w:after="0"/>
+        <w:ind w:start="799" w:end="90" w:hanging="283"/>
+        <w:jc w:val="start"/>
+        <w:rPr/>
+      </w:pPr>
+      <w:r>
+        <w:rPr>
+          <w:rStyle w:val="SourceText"/>
+        </w:rPr>
+        <w:t>hiking</w:t>
+      </w:r>
+      <w:r>
+        <w:rPr/>
+        <w:t xml:space="preserve"> Conda/Python/CUDA </w:t>
+      </w:r>
+      <w:r>
+        <w:rPr/>
+        <w:t xml:space="preserve">环境； </w:t>
+      </w:r>
+    </w:p>
+    <w:p>
+      <w:pPr>
+        <w:pStyle w:val="TextBody"/>
+        <w:numPr>
+          <w:ilvl w:val="0"/>
+          <w:numId w:val="26"/>
+        </w:numPr>
+        <w:tabs>
+          <w:tab w:val="clear" w:pos="1134"/>
+          <w:tab w:val="left" w:pos="799" w:leader="none"/>
+        </w:tabs>
+        <w:bidi w:val="0"/>
+        <w:spacing w:before="90" w:after="0"/>
+        <w:ind w:start="799" w:end="90" w:hanging="283"/>
+        <w:jc w:val="start"/>
+        <w:rPr/>
+      </w:pPr>
+      <w:r>
+        <w:rPr/>
+        <w:t xml:space="preserve">AMASS/Parkour motion reference </w:t>
+      </w:r>
+      <w:r>
+        <w:rPr/>
+        <w:t xml:space="preserve">数据； </w:t>
+      </w:r>
+    </w:p>
+    <w:p>
+      <w:pPr>
+        <w:pStyle w:val="TextBody"/>
+        <w:numPr>
+          <w:ilvl w:val="0"/>
+          <w:numId w:val="26"/>
+        </w:numPr>
+        <w:tabs>
+          <w:tab w:val="clear" w:pos="1134"/>
+          <w:tab w:val="left" w:pos="799" w:leader="none"/>
+        </w:tabs>
+        <w:bidi w:val="0"/>
+        <w:ind w:start="799" w:end="90" w:hanging="283"/>
+        <w:jc w:val="start"/>
+        <w:rPr/>
+      </w:pPr>
+      <w:r>
+        <w:rPr/>
+        <w:t>checkpoint</w:t>
+      </w:r>
+      <w:r>
+        <w:rPr/>
+        <w:t xml:space="preserve">、训练日志与 </w:t>
+      </w:r>
+      <w:r>
+        <w:rPr/>
+        <w:t xml:space="preserve">TensorBoard </w:t>
+      </w:r>
+      <w:r>
+        <w:rPr/>
+        <w:t xml:space="preserve">数据。 </w:t>
+      </w:r>
+    </w:p>
+    <w:p>
+      <w:pPr>
+        <w:pStyle w:val="TextBody"/>
+        <w:bidi w:val="0"/>
+        <w:jc w:val="start"/>
+        <w:rPr/>
+      </w:pPr>
+      <w:r>
+        <w:rPr/>
+        <w:t>进入正确环境并设置运动数据后运行：</w:t>
+      </w:r>
+    </w:p>
+    <w:p>
+      <w:pPr>
+        <w:pStyle w:val="PreformattedText"/>
+        <w:bidi w:val="0"/>
+        <w:spacing w:before="0" w:after="283"/>
+        <w:jc w:val="start"/>
+        <w:rPr/>
+      </w:pPr>
+      <w:r>
+        <w:rPr/>
+        <w:t>./scripts/bootstrap_foothold.sh --check-only</w:t>
+      </w:r>
+    </w:p>
+    <w:p>
+      <w:pPr>
+        <w:pStyle w:val="TextBody"/>
+        <w:bidi w:val="0"/>
+        <w:spacing w:before="90" w:after="135"/>
+        <w:ind w:start="90" w:end="90" w:hanging="0"/>
+        <w:jc w:val="start"/>
+        <w:rPr/>
+      </w:pPr>
+      <w:r>
+        <w:rPr/>
+        <w:t xml:space="preserve">最后一行出现 </w:t>
+      </w:r>
+      <w:r>
+        <w:rPr>
+          <w:rStyle w:val="SourceText"/>
+        </w:rPr>
+        <w:t>Foothold project dependencies are ready.</w:t>
+      </w:r>
+      <w:r>
+        <w:rPr/>
+        <w:t xml:space="preserve"> </w:t>
+      </w:r>
+      <w:r>
+        <w:rPr/>
+        <w:t>才表示源码、运行时和运动筛选文件均可见。</w:t>
       </w:r>
     </w:p>
     <w:p>
@@ -12845,7 +13129,7 @@
         <w:pStyle w:val="TextBody"/>
         <w:numPr>
           <w:ilvl w:val="0"/>
-          <w:numId w:val="26"/>
+          <w:numId w:val="27"/>
         </w:numPr>
         <w:tabs>
           <w:tab w:val="clear" w:pos="1134"/>
@@ -12860,328 +13144,6 @@
       <w:r>
         <w:rPr/>
         <w:t xml:space="preserve">克隆指定分支并核对提交； </w:t>
-      </w:r>
-    </w:p>
-    <w:p>
-      <w:pPr>
-        <w:pStyle w:val="TextBody"/>
-        <w:numPr>
-          <w:ilvl w:val="0"/>
-          <w:numId w:val="26"/>
-        </w:numPr>
-        <w:tabs>
-          <w:tab w:val="clear" w:pos="1134"/>
-          <w:tab w:val="left" w:pos="799" w:leader="none"/>
-        </w:tabs>
-        <w:bidi w:val="0"/>
-        <w:spacing w:before="90" w:after="0"/>
-        <w:ind w:start="799" w:end="90" w:hanging="283"/>
-        <w:jc w:val="start"/>
-        <w:rPr/>
-      </w:pPr>
-      <w:r>
-        <w:rPr/>
-        <w:t xml:space="preserve">安装匹配依赖和数据； </w:t>
-      </w:r>
-    </w:p>
-    <w:p>
-      <w:pPr>
-        <w:pStyle w:val="TextBody"/>
-        <w:numPr>
-          <w:ilvl w:val="0"/>
-          <w:numId w:val="26"/>
-        </w:numPr>
-        <w:tabs>
-          <w:tab w:val="clear" w:pos="1134"/>
-          <w:tab w:val="left" w:pos="799" w:leader="none"/>
-        </w:tabs>
-        <w:bidi w:val="0"/>
-        <w:spacing w:before="90" w:after="0"/>
-        <w:ind w:start="799" w:end="90" w:hanging="283"/>
-        <w:jc w:val="start"/>
-        <w:rPr/>
-      </w:pPr>
-      <w:r>
-        <w:rPr/>
-        <w:t xml:space="preserve">跑全量 </w:t>
-      </w:r>
-      <w:r>
-        <w:rPr/>
-        <w:t xml:space="preserve">foothold </w:t>
-      </w:r>
-      <w:r>
-        <w:rPr/>
-        <w:t xml:space="preserve">测试； </w:t>
-      </w:r>
-    </w:p>
-    <w:p>
-      <w:pPr>
-        <w:pStyle w:val="TextBody"/>
-        <w:numPr>
-          <w:ilvl w:val="0"/>
-          <w:numId w:val="26"/>
-        </w:numPr>
-        <w:tabs>
-          <w:tab w:val="clear" w:pos="1134"/>
-          <w:tab w:val="left" w:pos="799" w:leader="none"/>
-        </w:tabs>
-        <w:bidi w:val="0"/>
-        <w:spacing w:before="90" w:after="0"/>
-        <w:ind w:start="799" w:end="90" w:hanging="283"/>
-        <w:jc w:val="start"/>
-        <w:rPr/>
-      </w:pPr>
-      <w:r>
-        <w:rPr/>
-        <w:t xml:space="preserve">用已知 </w:t>
-      </w:r>
-      <w:r>
-        <w:rPr/>
-        <w:t xml:space="preserve">checkpoint </w:t>
-      </w:r>
-      <w:r>
-        <w:rPr/>
-        <w:t xml:space="preserve">跑台阶 </w:t>
-      </w:r>
-      <w:r>
-        <w:rPr/>
-        <w:t>Play</w:t>
-      </w:r>
-      <w:r>
-        <w:rPr/>
-        <w:t xml:space="preserve">； </w:t>
-      </w:r>
-    </w:p>
-    <w:p>
-      <w:pPr>
-        <w:pStyle w:val="TextBody"/>
-        <w:numPr>
-          <w:ilvl w:val="0"/>
-          <w:numId w:val="26"/>
-        </w:numPr>
-        <w:tabs>
-          <w:tab w:val="clear" w:pos="1134"/>
-          <w:tab w:val="left" w:pos="799" w:leader="none"/>
-        </w:tabs>
-        <w:bidi w:val="0"/>
-        <w:spacing w:before="90" w:after="0"/>
-        <w:ind w:start="799" w:end="90" w:hanging="283"/>
-        <w:jc w:val="start"/>
-        <w:rPr/>
-      </w:pPr>
-      <w:r>
-        <w:rPr/>
-        <w:t>对照日志确认两个环境命令、</w:t>
-      </w:r>
-      <w:r>
-        <w:rPr/>
-        <w:t xml:space="preserve">Marker </w:t>
-      </w:r>
-      <w:r>
-        <w:rPr/>
-        <w:t xml:space="preserve">含义和状态机； </w:t>
-      </w:r>
-    </w:p>
-    <w:p>
-      <w:pPr>
-        <w:pStyle w:val="TextBody"/>
-        <w:numPr>
-          <w:ilvl w:val="0"/>
-          <w:numId w:val="26"/>
-        </w:numPr>
-        <w:tabs>
-          <w:tab w:val="clear" w:pos="1134"/>
-          <w:tab w:val="left" w:pos="799" w:leader="none"/>
-        </w:tabs>
-        <w:bidi w:val="0"/>
-        <w:ind w:start="799" w:end="90" w:hanging="283"/>
-        <w:jc w:val="start"/>
-        <w:rPr/>
-      </w:pPr>
-      <w:r>
-        <w:rPr/>
-        <w:t xml:space="preserve">不修改算法。 </w:t>
-      </w:r>
-    </w:p>
-    <w:p>
-      <w:pPr>
-        <w:pStyle w:val="Heading3"/>
-        <w:bidi w:val="0"/>
-        <w:jc w:val="start"/>
-        <w:rPr/>
-      </w:pPr>
-      <w:bookmarkStart w:id="51" w:name="第二阶段-定位当前性能瓶颈"/>
-      <w:bookmarkEnd w:id="51"/>
-      <w:r>
-        <w:rPr/>
-        <w:t>第二阶段：定位当前性能瓶颈</w:t>
-      </w:r>
-    </w:p>
-    <w:p>
-      <w:pPr>
-        <w:pStyle w:val="TextBody"/>
-        <w:bidi w:val="0"/>
-        <w:spacing w:before="90" w:after="135"/>
-        <w:ind w:start="90" w:end="90" w:hanging="0"/>
-        <w:jc w:val="start"/>
-        <w:rPr/>
-      </w:pPr>
-      <w:r>
-        <w:rPr/>
-        <w:t>按下面顺序拆问题，不要同时改奖励、状态机和网络：</w:t>
-      </w:r>
-    </w:p>
-    <w:p>
-      <w:pPr>
-        <w:pStyle w:val="PreformattedText"/>
-        <w:keepLines/>
-        <w:shd w:val="clear" w:fill="111827"/>
-        <w:bidi w:val="0"/>
-        <w:spacing w:lineRule="auto" w:line="338" w:before="0" w:after="0"/>
-        <w:jc w:val="start"/>
-        <w:rPr/>
-      </w:pPr>
-      <w:r>
-        <w:rPr/>
-        <w:t xml:space="preserve">Planner </w:t>
-      </w:r>
-      <w:r>
-        <w:rPr/>
-        <w:t>是否产生提案？</w:t>
-      </w:r>
-    </w:p>
-    <w:p>
-      <w:pPr>
-        <w:pStyle w:val="PreformattedText"/>
-        <w:keepLines/>
-        <w:shd w:val="clear" w:fill="111827"/>
-        <w:bidi w:val="0"/>
-        <w:spacing w:lineRule="auto" w:line="338" w:before="0" w:after="0"/>
-        <w:jc w:val="start"/>
-        <w:rPr/>
-      </w:pPr>
-      <w:r>
-        <w:rPr/>
-        <w:t xml:space="preserve">→ </w:t>
-      </w:r>
-      <w:r>
-        <w:rPr/>
-        <w:t>提案是否几何有效？</w:t>
-      </w:r>
-    </w:p>
-    <w:p>
-      <w:pPr>
-        <w:pStyle w:val="PreformattedText"/>
-        <w:keepLines/>
-        <w:shd w:val="clear" w:fill="111827"/>
-        <w:bidi w:val="0"/>
-        <w:spacing w:lineRule="auto" w:line="338" w:before="0" w:after="0"/>
-        <w:jc w:val="start"/>
-        <w:rPr/>
-      </w:pPr>
-      <w:r>
-        <w:rPr/>
-        <w:t xml:space="preserve">→ </w:t>
-      </w:r>
-      <w:r>
-        <w:rPr/>
-        <w:t>是否有危险圆柱侵入？</w:t>
-      </w:r>
-    </w:p>
-    <w:p>
-      <w:pPr>
-        <w:pStyle w:val="PreformattedText"/>
-        <w:keepLines/>
-        <w:shd w:val="clear" w:fill="111827"/>
-        <w:bidi w:val="0"/>
-        <w:spacing w:lineRule="auto" w:line="338" w:before="0" w:after="0"/>
-        <w:jc w:val="start"/>
-        <w:rPr/>
-      </w:pPr>
-      <w:r>
-        <w:rPr/>
-        <w:t xml:space="preserve">→ </w:t>
-      </w:r>
-      <w:r>
-        <w:rPr/>
-        <w:t>是否通过完整轨迹预检？</w:t>
-      </w:r>
-    </w:p>
-    <w:p>
-      <w:pPr>
-        <w:pStyle w:val="PreformattedText"/>
-        <w:keepLines/>
-        <w:shd w:val="clear" w:fill="111827"/>
-        <w:bidi w:val="0"/>
-        <w:spacing w:lineRule="auto" w:line="338" w:before="0" w:after="0"/>
-        <w:jc w:val="start"/>
-        <w:rPr/>
-      </w:pPr>
-      <w:r>
-        <w:rPr/>
-        <w:t xml:space="preserve">→ </w:t>
-      </w:r>
-      <w:r>
-        <w:rPr/>
-        <w:t>最终是否执行学习点？</w:t>
-      </w:r>
-    </w:p>
-    <w:p>
-      <w:pPr>
-        <w:pStyle w:val="PreformattedText"/>
-        <w:keepLines/>
-        <w:shd w:val="clear" w:fill="111827"/>
-        <w:bidi w:val="0"/>
-        <w:spacing w:lineRule="auto" w:line="338" w:before="0" w:after="0"/>
-        <w:jc w:val="start"/>
-        <w:rPr/>
-      </w:pPr>
-      <w:r>
-        <w:rPr/>
-        <w:t xml:space="preserve">→ </w:t>
-      </w:r>
-      <w:r>
-        <w:rPr/>
-        <w:t>电机脚是否跟到轨迹？</w:t>
-      </w:r>
-    </w:p>
-    <w:p>
-      <w:pPr>
-        <w:pStyle w:val="PreformattedText"/>
-        <w:bidi w:val="0"/>
-        <w:spacing w:before="0" w:after="283"/>
-        <w:jc w:val="start"/>
-        <w:rPr/>
-      </w:pPr>
-      <w:r>
-        <w:rPr/>
-        <w:t xml:space="preserve">→ </w:t>
-      </w:r>
-      <w:r>
-        <w:rPr/>
-        <w:t xml:space="preserve">接触为何进入 </w:t>
-      </w:r>
-      <w:r>
-        <w:rPr/>
-        <w:t>Recovery</w:t>
-      </w:r>
-      <w:r>
-        <w:rPr/>
-        <w:t>？</w:t>
-      </w:r>
-    </w:p>
-    <w:p>
-      <w:pPr>
-        <w:pStyle w:val="TextBody"/>
-        <w:bidi w:val="0"/>
-        <w:spacing w:before="90" w:after="135"/>
-        <w:ind w:start="90" w:end="90" w:hanging="0"/>
-        <w:jc w:val="start"/>
-        <w:rPr/>
-      </w:pPr>
-      <w:r>
-        <w:rPr/>
-        <w:t>重点指标：</w:t>
       </w:r>
     </w:p>
     <w:p>
@@ -13203,7 +13165,7 @@
       </w:pPr>
       <w:r>
         <w:rPr/>
-        <w:t xml:space="preserve">学习事件数； </w:t>
+        <w:t xml:space="preserve">安装匹配依赖和数据； </w:t>
       </w:r>
     </w:p>
     <w:p>
@@ -13225,15 +13187,15 @@
       </w:pPr>
       <w:r>
         <w:rPr/>
-        <w:t>名义安全</w:t>
-      </w:r>
-      <w:r>
-        <w:rPr/>
-        <w:t>/</w:t>
-      </w:r>
-      <w:r>
-        <w:rPr/>
-        <w:t xml:space="preserve">不安全事件比例； </w:t>
+        <w:t xml:space="preserve">跑全量 </w:t>
+      </w:r>
+      <w:r>
+        <w:rPr/>
+        <w:t xml:space="preserve">foothold </w:t>
+      </w:r>
+      <w:r>
+        <w:rPr/>
+        <w:t xml:space="preserve">测试； </w:t>
       </w:r>
     </w:p>
     <w:p>
@@ -13255,7 +13217,23 @@
       </w:pPr>
       <w:r>
         <w:rPr/>
-        <w:t xml:space="preserve">不安全名义点修正成功率； </w:t>
+        <w:t xml:space="preserve">用已知 </w:t>
+      </w:r>
+      <w:r>
+        <w:rPr/>
+        <w:t xml:space="preserve">checkpoint </w:t>
+      </w:r>
+      <w:r>
+        <w:rPr/>
+        <w:t xml:space="preserve">跑台阶 </w:t>
+      </w:r>
+      <w:r>
+        <w:rPr/>
+        <w:t>Play</w:t>
+      </w:r>
+      <w:r>
+        <w:rPr/>
+        <w:t xml:space="preserve">； </w:t>
       </w:r>
     </w:p>
     <w:p>
@@ -13277,7 +13255,15 @@
       </w:pPr>
       <w:r>
         <w:rPr/>
-        <w:t xml:space="preserve">学习点路由率与回退率； </w:t>
+        <w:t>对照日志确认两个环境命令、</w:t>
+      </w:r>
+      <w:r>
+        <w:rPr/>
+        <w:t xml:space="preserve">Marker </w:t>
+      </w:r>
+      <w:r>
+        <w:rPr/>
+        <w:t xml:space="preserve">含义和状态机； </w:t>
       </w:r>
     </w:p>
     <w:p>
@@ -13292,141 +13278,13 @@
           <w:tab w:val="left" w:pos="799" w:leader="none"/>
         </w:tabs>
         <w:bidi w:val="0"/>
-        <w:spacing w:before="90" w:after="0"/>
         <w:ind w:start="799" w:end="90" w:hanging="283"/>
         <w:jc w:val="start"/>
         <w:rPr/>
       </w:pPr>
       <w:r>
         <w:rPr/>
-        <w:t xml:space="preserve">几何无效、端点不安全、预检不安全各自比例； </w:t>
-      </w:r>
-    </w:p>
-    <w:p>
-      <w:pPr>
-        <w:pStyle w:val="TextBody"/>
-        <w:numPr>
-          <w:ilvl w:val="0"/>
-          <w:numId w:val="27"/>
-        </w:numPr>
-        <w:tabs>
-          <w:tab w:val="clear" w:pos="1134"/>
-          <w:tab w:val="left" w:pos="799" w:leader="none"/>
-        </w:tabs>
-        <w:bidi w:val="0"/>
-        <w:spacing w:before="90" w:after="0"/>
-        <w:ind w:start="799" w:end="90" w:hanging="283"/>
-        <w:jc w:val="start"/>
-        <w:rPr/>
-      </w:pPr>
-      <w:r>
-        <w:rPr/>
-        <w:t>Planner KL</w:t>
-      </w:r>
-      <w:r>
-        <w:rPr/>
-        <w:t xml:space="preserve">、标准差、梯度范数； </w:t>
-      </w:r>
-    </w:p>
-    <w:p>
-      <w:pPr>
-        <w:pStyle w:val="TextBody"/>
-        <w:numPr>
-          <w:ilvl w:val="0"/>
-          <w:numId w:val="27"/>
-        </w:numPr>
-        <w:tabs>
-          <w:tab w:val="clear" w:pos="1134"/>
-          <w:tab w:val="left" w:pos="799" w:leader="none"/>
-        </w:tabs>
-        <w:bidi w:val="0"/>
-        <w:spacing w:before="90" w:after="0"/>
-        <w:ind w:start="799" w:end="90" w:hanging="283"/>
-        <w:jc w:val="start"/>
-        <w:rPr/>
-      </w:pPr>
-      <w:r>
-        <w:rPr/>
-        <w:t xml:space="preserve">摆动 </w:t>
-      </w:r>
-      <w:r>
-        <w:rPr/>
-        <w:t xml:space="preserve">XY/Z </w:t>
-      </w:r>
-      <w:r>
-        <w:rPr/>
-        <w:t xml:space="preserve">误差与 </w:t>
-      </w:r>
-      <w:r>
-        <w:rPr/>
-        <w:t xml:space="preserve">Touchdown </w:t>
-      </w:r>
-      <w:r>
-        <w:rPr/>
-        <w:t xml:space="preserve">误差； </w:t>
-      </w:r>
-    </w:p>
-    <w:p>
-      <w:pPr>
-        <w:pStyle w:val="TextBody"/>
-        <w:numPr>
-          <w:ilvl w:val="0"/>
-          <w:numId w:val="27"/>
-        </w:numPr>
-        <w:tabs>
-          <w:tab w:val="clear" w:pos="1134"/>
-          <w:tab w:val="left" w:pos="799" w:leader="none"/>
-        </w:tabs>
-        <w:bidi w:val="0"/>
-        <w:spacing w:before="90" w:after="0"/>
-        <w:ind w:start="799" w:end="90" w:hanging="283"/>
-        <w:jc w:val="start"/>
-        <w:rPr/>
-      </w:pPr>
-      <w:r>
-        <w:rPr/>
-        <w:t>提前接触、未离地、</w:t>
-      </w:r>
-      <w:r>
-        <w:rPr/>
-        <w:t>OVERDUE</w:t>
-      </w:r>
-      <w:r>
-        <w:rPr/>
-        <w:t>、</w:t>
-      </w:r>
-      <w:r>
-        <w:rPr/>
-        <w:t xml:space="preserve">Recovery </w:t>
-      </w:r>
-      <w:r>
-        <w:rPr/>
-        <w:t xml:space="preserve">入口原因； </w:t>
-      </w:r>
-    </w:p>
-    <w:p>
-      <w:pPr>
-        <w:pStyle w:val="TextBody"/>
-        <w:numPr>
-          <w:ilvl w:val="0"/>
-          <w:numId w:val="27"/>
-        </w:numPr>
-        <w:tabs>
-          <w:tab w:val="clear" w:pos="1134"/>
-          <w:tab w:val="left" w:pos="799" w:leader="none"/>
-        </w:tabs>
-        <w:bidi w:val="0"/>
-        <w:ind w:start="799" w:end="90" w:hanging="283"/>
-        <w:jc w:val="start"/>
-        <w:rPr/>
-      </w:pPr>
-      <w:r>
-        <w:rPr/>
-        <w:t xml:space="preserve">Recovery </w:t>
-      </w:r>
-      <w:r>
-        <w:rPr/>
-        <w:t xml:space="preserve">持续比例和每次摆动触发次数。 </w:t>
+        <w:t xml:space="preserve">不修改算法。 </w:t>
       </w:r>
     </w:p>
     <w:p>
@@ -13436,11 +13294,11 @@
         <w:jc w:val="start"/>
         <w:rPr/>
       </w:pPr>
-      <w:bookmarkStart w:id="52" w:name="第三阶段-一次只验证一个假设"/>
-      <w:bookmarkEnd w:id="52"/>
-      <w:r>
-        <w:rPr/>
-        <w:t>第三阶段：一次只验证一个假设</w:t>
+      <w:bookmarkStart w:id="51" w:name="第二阶段-定位当前性能瓶颈"/>
+      <w:bookmarkEnd w:id="51"/>
+      <w:r>
+        <w:rPr/>
+        <w:t>第二阶段：定位当前性能瓶颈</w:t>
       </w:r>
     </w:p>
     <w:p>
@@ -13454,7 +13312,160 @@
       </w:pPr>
       <w:r>
         <w:rPr/>
-        <w:t>推荐优先级：</w:t>
+        <w:t>按下面顺序拆问题，不要同时改奖励、状态机和网络：</w:t>
+      </w:r>
+    </w:p>
+    <w:p>
+      <w:pPr>
+        <w:pStyle w:val="PreformattedText"/>
+        <w:keepLines/>
+        <w:shd w:val="clear" w:fill="111827"/>
+        <w:bidi w:val="0"/>
+        <w:spacing w:lineRule="auto" w:line="338" w:before="0" w:after="0"/>
+        <w:jc w:val="start"/>
+        <w:rPr/>
+      </w:pPr>
+      <w:r>
+        <w:rPr/>
+        <w:t xml:space="preserve">Planner </w:t>
+      </w:r>
+      <w:r>
+        <w:rPr/>
+        <w:t>是否产生提案？</w:t>
+      </w:r>
+    </w:p>
+    <w:p>
+      <w:pPr>
+        <w:pStyle w:val="PreformattedText"/>
+        <w:keepLines/>
+        <w:shd w:val="clear" w:fill="111827"/>
+        <w:bidi w:val="0"/>
+        <w:spacing w:lineRule="auto" w:line="338" w:before="0" w:after="0"/>
+        <w:jc w:val="start"/>
+        <w:rPr/>
+      </w:pPr>
+      <w:r>
+        <w:rPr/>
+        <w:t xml:space="preserve">→ </w:t>
+      </w:r>
+      <w:r>
+        <w:rPr/>
+        <w:t>提案是否几何有效？</w:t>
+      </w:r>
+    </w:p>
+    <w:p>
+      <w:pPr>
+        <w:pStyle w:val="PreformattedText"/>
+        <w:keepLines/>
+        <w:shd w:val="clear" w:fill="111827"/>
+        <w:bidi w:val="0"/>
+        <w:spacing w:lineRule="auto" w:line="338" w:before="0" w:after="0"/>
+        <w:jc w:val="start"/>
+        <w:rPr/>
+      </w:pPr>
+      <w:r>
+        <w:rPr/>
+        <w:t xml:space="preserve">→ </w:t>
+      </w:r>
+      <w:r>
+        <w:rPr/>
+        <w:t>是否有危险圆柱侵入？</w:t>
+      </w:r>
+    </w:p>
+    <w:p>
+      <w:pPr>
+        <w:pStyle w:val="PreformattedText"/>
+        <w:keepLines/>
+        <w:shd w:val="clear" w:fill="111827"/>
+        <w:bidi w:val="0"/>
+        <w:spacing w:lineRule="auto" w:line="338" w:before="0" w:after="0"/>
+        <w:jc w:val="start"/>
+        <w:rPr/>
+      </w:pPr>
+      <w:r>
+        <w:rPr/>
+        <w:t xml:space="preserve">→ </w:t>
+      </w:r>
+      <w:r>
+        <w:rPr/>
+        <w:t>是否通过完整轨迹预检？</w:t>
+      </w:r>
+    </w:p>
+    <w:p>
+      <w:pPr>
+        <w:pStyle w:val="PreformattedText"/>
+        <w:keepLines/>
+        <w:shd w:val="clear" w:fill="111827"/>
+        <w:bidi w:val="0"/>
+        <w:spacing w:lineRule="auto" w:line="338" w:before="0" w:after="0"/>
+        <w:jc w:val="start"/>
+        <w:rPr/>
+      </w:pPr>
+      <w:r>
+        <w:rPr/>
+        <w:t xml:space="preserve">→ </w:t>
+      </w:r>
+      <w:r>
+        <w:rPr/>
+        <w:t>最终是否执行学习点？</w:t>
+      </w:r>
+    </w:p>
+    <w:p>
+      <w:pPr>
+        <w:pStyle w:val="PreformattedText"/>
+        <w:keepLines/>
+        <w:shd w:val="clear" w:fill="111827"/>
+        <w:bidi w:val="0"/>
+        <w:spacing w:lineRule="auto" w:line="338" w:before="0" w:after="0"/>
+        <w:jc w:val="start"/>
+        <w:rPr/>
+      </w:pPr>
+      <w:r>
+        <w:rPr/>
+        <w:t xml:space="preserve">→ </w:t>
+      </w:r>
+      <w:r>
+        <w:rPr/>
+        <w:t>电机脚是否跟到轨迹？</w:t>
+      </w:r>
+    </w:p>
+    <w:p>
+      <w:pPr>
+        <w:pStyle w:val="PreformattedText"/>
+        <w:bidi w:val="0"/>
+        <w:spacing w:before="0" w:after="283"/>
+        <w:jc w:val="start"/>
+        <w:rPr/>
+      </w:pPr>
+      <w:r>
+        <w:rPr/>
+        <w:t xml:space="preserve">→ </w:t>
+      </w:r>
+      <w:r>
+        <w:rPr/>
+        <w:t xml:space="preserve">接触为何进入 </w:t>
+      </w:r>
+      <w:r>
+        <w:rPr/>
+        <w:t>Recovery</w:t>
+      </w:r>
+      <w:r>
+        <w:rPr/>
+        <w:t>？</w:t>
+      </w:r>
+    </w:p>
+    <w:p>
+      <w:pPr>
+        <w:pStyle w:val="TextBody"/>
+        <w:bidi w:val="0"/>
+        <w:spacing w:before="90" w:after="135"/>
+        <w:ind w:start="90" w:end="90" w:hanging="0"/>
+        <w:jc w:val="start"/>
+        <w:rPr/>
+      </w:pPr>
+      <w:r>
+        <w:rPr/>
+        <w:t>重点指标：</w:t>
       </w:r>
     </w:p>
     <w:p>
@@ -13476,6 +13487,279 @@
       </w:pPr>
       <w:r>
         <w:rPr/>
+        <w:t xml:space="preserve">学习事件数； </w:t>
+      </w:r>
+    </w:p>
+    <w:p>
+      <w:pPr>
+        <w:pStyle w:val="TextBody"/>
+        <w:numPr>
+          <w:ilvl w:val="0"/>
+          <w:numId w:val="28"/>
+        </w:numPr>
+        <w:tabs>
+          <w:tab w:val="clear" w:pos="1134"/>
+          <w:tab w:val="left" w:pos="799" w:leader="none"/>
+        </w:tabs>
+        <w:bidi w:val="0"/>
+        <w:spacing w:before="90" w:after="0"/>
+        <w:ind w:start="799" w:end="90" w:hanging="283"/>
+        <w:jc w:val="start"/>
+        <w:rPr/>
+      </w:pPr>
+      <w:r>
+        <w:rPr/>
+        <w:t>名义安全</w:t>
+      </w:r>
+      <w:r>
+        <w:rPr/>
+        <w:t>/</w:t>
+      </w:r>
+      <w:r>
+        <w:rPr/>
+        <w:t xml:space="preserve">不安全事件比例； </w:t>
+      </w:r>
+    </w:p>
+    <w:p>
+      <w:pPr>
+        <w:pStyle w:val="TextBody"/>
+        <w:numPr>
+          <w:ilvl w:val="0"/>
+          <w:numId w:val="28"/>
+        </w:numPr>
+        <w:tabs>
+          <w:tab w:val="clear" w:pos="1134"/>
+          <w:tab w:val="left" w:pos="799" w:leader="none"/>
+        </w:tabs>
+        <w:bidi w:val="0"/>
+        <w:spacing w:before="90" w:after="0"/>
+        <w:ind w:start="799" w:end="90" w:hanging="283"/>
+        <w:jc w:val="start"/>
+        <w:rPr/>
+      </w:pPr>
+      <w:r>
+        <w:rPr/>
+        <w:t xml:space="preserve">不安全名义点修正成功率； </w:t>
+      </w:r>
+    </w:p>
+    <w:p>
+      <w:pPr>
+        <w:pStyle w:val="TextBody"/>
+        <w:numPr>
+          <w:ilvl w:val="0"/>
+          <w:numId w:val="28"/>
+        </w:numPr>
+        <w:tabs>
+          <w:tab w:val="clear" w:pos="1134"/>
+          <w:tab w:val="left" w:pos="799" w:leader="none"/>
+        </w:tabs>
+        <w:bidi w:val="0"/>
+        <w:spacing w:before="90" w:after="0"/>
+        <w:ind w:start="799" w:end="90" w:hanging="283"/>
+        <w:jc w:val="start"/>
+        <w:rPr/>
+      </w:pPr>
+      <w:r>
+        <w:rPr/>
+        <w:t xml:space="preserve">学习点路由率与回退率； </w:t>
+      </w:r>
+    </w:p>
+    <w:p>
+      <w:pPr>
+        <w:pStyle w:val="TextBody"/>
+        <w:numPr>
+          <w:ilvl w:val="0"/>
+          <w:numId w:val="28"/>
+        </w:numPr>
+        <w:tabs>
+          <w:tab w:val="clear" w:pos="1134"/>
+          <w:tab w:val="left" w:pos="799" w:leader="none"/>
+        </w:tabs>
+        <w:bidi w:val="0"/>
+        <w:spacing w:before="90" w:after="0"/>
+        <w:ind w:start="799" w:end="90" w:hanging="283"/>
+        <w:jc w:val="start"/>
+        <w:rPr/>
+      </w:pPr>
+      <w:r>
+        <w:rPr/>
+        <w:t xml:space="preserve">几何无效、端点不安全、预检不安全各自比例； </w:t>
+      </w:r>
+    </w:p>
+    <w:p>
+      <w:pPr>
+        <w:pStyle w:val="TextBody"/>
+        <w:numPr>
+          <w:ilvl w:val="0"/>
+          <w:numId w:val="28"/>
+        </w:numPr>
+        <w:tabs>
+          <w:tab w:val="clear" w:pos="1134"/>
+          <w:tab w:val="left" w:pos="799" w:leader="none"/>
+        </w:tabs>
+        <w:bidi w:val="0"/>
+        <w:spacing w:before="90" w:after="0"/>
+        <w:ind w:start="799" w:end="90" w:hanging="283"/>
+        <w:jc w:val="start"/>
+        <w:rPr/>
+      </w:pPr>
+      <w:r>
+        <w:rPr/>
+        <w:t>Planner KL</w:t>
+      </w:r>
+      <w:r>
+        <w:rPr/>
+        <w:t xml:space="preserve">、标准差、梯度范数； </w:t>
+      </w:r>
+    </w:p>
+    <w:p>
+      <w:pPr>
+        <w:pStyle w:val="TextBody"/>
+        <w:numPr>
+          <w:ilvl w:val="0"/>
+          <w:numId w:val="28"/>
+        </w:numPr>
+        <w:tabs>
+          <w:tab w:val="clear" w:pos="1134"/>
+          <w:tab w:val="left" w:pos="799" w:leader="none"/>
+        </w:tabs>
+        <w:bidi w:val="0"/>
+        <w:spacing w:before="90" w:after="0"/>
+        <w:ind w:start="799" w:end="90" w:hanging="283"/>
+        <w:jc w:val="start"/>
+        <w:rPr/>
+      </w:pPr>
+      <w:r>
+        <w:rPr/>
+        <w:t xml:space="preserve">摆动 </w:t>
+      </w:r>
+      <w:r>
+        <w:rPr/>
+        <w:t xml:space="preserve">XY/Z </w:t>
+      </w:r>
+      <w:r>
+        <w:rPr/>
+        <w:t xml:space="preserve">误差与 </w:t>
+      </w:r>
+      <w:r>
+        <w:rPr/>
+        <w:t xml:space="preserve">Touchdown </w:t>
+      </w:r>
+      <w:r>
+        <w:rPr/>
+        <w:t xml:space="preserve">误差； </w:t>
+      </w:r>
+    </w:p>
+    <w:p>
+      <w:pPr>
+        <w:pStyle w:val="TextBody"/>
+        <w:numPr>
+          <w:ilvl w:val="0"/>
+          <w:numId w:val="28"/>
+        </w:numPr>
+        <w:tabs>
+          <w:tab w:val="clear" w:pos="1134"/>
+          <w:tab w:val="left" w:pos="799" w:leader="none"/>
+        </w:tabs>
+        <w:bidi w:val="0"/>
+        <w:spacing w:before="90" w:after="0"/>
+        <w:ind w:start="799" w:end="90" w:hanging="283"/>
+        <w:jc w:val="start"/>
+        <w:rPr/>
+      </w:pPr>
+      <w:r>
+        <w:rPr/>
+        <w:t>提前接触、未离地、</w:t>
+      </w:r>
+      <w:r>
+        <w:rPr/>
+        <w:t>OVERDUE</w:t>
+      </w:r>
+      <w:r>
+        <w:rPr/>
+        <w:t>、</w:t>
+      </w:r>
+      <w:r>
+        <w:rPr/>
+        <w:t xml:space="preserve">Recovery </w:t>
+      </w:r>
+      <w:r>
+        <w:rPr/>
+        <w:t xml:space="preserve">入口原因； </w:t>
+      </w:r>
+    </w:p>
+    <w:p>
+      <w:pPr>
+        <w:pStyle w:val="TextBody"/>
+        <w:numPr>
+          <w:ilvl w:val="0"/>
+          <w:numId w:val="28"/>
+        </w:numPr>
+        <w:tabs>
+          <w:tab w:val="clear" w:pos="1134"/>
+          <w:tab w:val="left" w:pos="799" w:leader="none"/>
+        </w:tabs>
+        <w:bidi w:val="0"/>
+        <w:ind w:start="799" w:end="90" w:hanging="283"/>
+        <w:jc w:val="start"/>
+        <w:rPr/>
+      </w:pPr>
+      <w:r>
+        <w:rPr/>
+        <w:t xml:space="preserve">Recovery </w:t>
+      </w:r>
+      <w:r>
+        <w:rPr/>
+        <w:t xml:space="preserve">持续比例和每次摆动触发次数。 </w:t>
+      </w:r>
+    </w:p>
+    <w:p>
+      <w:pPr>
+        <w:pStyle w:val="Heading3"/>
+        <w:bidi w:val="0"/>
+        <w:jc w:val="start"/>
+        <w:rPr/>
+      </w:pPr>
+      <w:bookmarkStart w:id="52" w:name="第三阶段-一次只验证一个假设"/>
+      <w:bookmarkEnd w:id="52"/>
+      <w:r>
+        <w:rPr/>
+        <w:t>第三阶段：一次只验证一个假设</w:t>
+      </w:r>
+    </w:p>
+    <w:p>
+      <w:pPr>
+        <w:pStyle w:val="TextBody"/>
+        <w:bidi w:val="0"/>
+        <w:spacing w:before="90" w:after="135"/>
+        <w:ind w:start="90" w:end="90" w:hanging="0"/>
+        <w:jc w:val="start"/>
+        <w:rPr/>
+      </w:pPr>
+      <w:r>
+        <w:rPr/>
+        <w:t>推荐优先级：</w:t>
+      </w:r>
+    </w:p>
+    <w:p>
+      <w:pPr>
+        <w:pStyle w:val="TextBody"/>
+        <w:numPr>
+          <w:ilvl w:val="0"/>
+          <w:numId w:val="29"/>
+        </w:numPr>
+        <w:tabs>
+          <w:tab w:val="clear" w:pos="1134"/>
+          <w:tab w:val="left" w:pos="799" w:leader="none"/>
+        </w:tabs>
+        <w:bidi w:val="0"/>
+        <w:spacing w:before="90" w:after="0"/>
+        <w:ind w:start="799" w:end="90" w:hanging="283"/>
+        <w:jc w:val="start"/>
+        <w:rPr/>
+      </w:pPr>
+      <w:r>
+        <w:rPr/>
         <w:t xml:space="preserve">以 </w:t>
       </w:r>
       <w:r>
@@ -13506,7 +13790,7 @@
         <w:pStyle w:val="TextBody"/>
         <w:numPr>
           <w:ilvl w:val="0"/>
-          <w:numId w:val="28"/>
+          <w:numId w:val="29"/>
         </w:numPr>
         <w:tabs>
           <w:tab w:val="clear" w:pos="1134"/>
@@ -13538,7 +13822,7 @@
         <w:pStyle w:val="TextBody"/>
         <w:numPr>
           <w:ilvl w:val="0"/>
-          <w:numId w:val="28"/>
+          <w:numId w:val="29"/>
         </w:numPr>
         <w:tabs>
           <w:tab w:val="clear" w:pos="1134"/>
@@ -13561,116 +13845,6 @@
       <w:r>
         <w:rPr/>
         <w:t xml:space="preserve">； </w:t>
-      </w:r>
-    </w:p>
-    <w:p>
-      <w:pPr>
-        <w:pStyle w:val="TextBody"/>
-        <w:numPr>
-          <w:ilvl w:val="0"/>
-          <w:numId w:val="28"/>
-        </w:numPr>
-        <w:tabs>
-          <w:tab w:val="clear" w:pos="1134"/>
-          <w:tab w:val="left" w:pos="799" w:leader="none"/>
-        </w:tabs>
-        <w:bidi w:val="0"/>
-        <w:spacing w:before="90" w:after="0"/>
-        <w:ind w:start="799" w:end="90" w:hanging="283"/>
-        <w:jc w:val="start"/>
-        <w:rPr/>
-      </w:pPr>
-      <w:r>
-        <w:rPr/>
-        <w:t xml:space="preserve">验证楼梯前停步是 </w:t>
-      </w:r>
-      <w:r>
-        <w:rPr/>
-        <w:t xml:space="preserve">Planner </w:t>
-      </w:r>
-      <w:r>
-        <w:rPr/>
-        <w:t xml:space="preserve">选点问题还是轨迹预检问题； </w:t>
-      </w:r>
-    </w:p>
-    <w:p>
-      <w:pPr>
-        <w:pStyle w:val="TextBody"/>
-        <w:numPr>
-          <w:ilvl w:val="0"/>
-          <w:numId w:val="28"/>
-        </w:numPr>
-        <w:tabs>
-          <w:tab w:val="clear" w:pos="1134"/>
-          <w:tab w:val="left" w:pos="799" w:leader="none"/>
-        </w:tabs>
-        <w:bidi w:val="0"/>
-        <w:spacing w:before="90" w:after="0"/>
-        <w:ind w:start="799" w:end="90" w:hanging="283"/>
-        <w:jc w:val="start"/>
-        <w:rPr/>
-      </w:pPr>
-      <w:r>
-        <w:rPr/>
-        <w:t xml:space="preserve">验证小跳是低层跟踪、提前触地还是 </w:t>
-      </w:r>
-      <w:r>
-        <w:rPr/>
-        <w:t xml:space="preserve">Recovery </w:t>
-      </w:r>
-      <w:r>
-        <w:rPr/>
-        <w:t xml:space="preserve">事务问题； </w:t>
-      </w:r>
-    </w:p>
-    <w:p>
-      <w:pPr>
-        <w:pStyle w:val="TextBody"/>
-        <w:numPr>
-          <w:ilvl w:val="0"/>
-          <w:numId w:val="28"/>
-        </w:numPr>
-        <w:tabs>
-          <w:tab w:val="clear" w:pos="1134"/>
-          <w:tab w:val="left" w:pos="799" w:leader="none"/>
-        </w:tabs>
-        <w:bidi w:val="0"/>
-        <w:ind w:start="799" w:end="90" w:hanging="283"/>
-        <w:jc w:val="start"/>
-        <w:rPr/>
-      </w:pPr>
-      <w:r>
-        <w:rPr/>
-        <w:t xml:space="preserve">最后再考虑修改奖励权重或网络结构。 </w:t>
-      </w:r>
-    </w:p>
-    <w:p>
-      <w:pPr>
-        <w:pStyle w:val="HorizontalLine"/>
-        <w:bidi w:val="0"/>
-        <w:jc w:val="start"/>
-        <w:rPr/>
-      </w:pPr>
-      <w:r>
-        <w:rPr/>
-      </w:r>
-    </w:p>
-    <w:p>
-      <w:pPr>
-        <w:pStyle w:val="Heading2"/>
-        <w:bidi w:val="0"/>
-        <w:jc w:val="start"/>
-        <w:rPr/>
-      </w:pPr>
-      <w:bookmarkStart w:id="53" w:name="14-修改代码时的硬性规则"/>
-      <w:bookmarkEnd w:id="53"/>
-      <w:r>
-        <w:rPr/>
-        <w:t xml:space="preserve">14. </w:t>
-      </w:r>
-      <w:r>
-        <w:rPr/>
-        <w:t>修改代码时的硬性规则</w:t>
       </w:r>
     </w:p>
     <w:p>
@@ -13692,7 +13866,15 @@
       </w:pPr>
       <w:r>
         <w:rPr/>
-        <w:t xml:space="preserve">先读当前源码，不以聊天记忆或旧文档代替； </w:t>
+        <w:t xml:space="preserve">验证楼梯前停步是 </w:t>
+      </w:r>
+      <w:r>
+        <w:rPr/>
+        <w:t xml:space="preserve">Planner </w:t>
+      </w:r>
+      <w:r>
+        <w:rPr/>
+        <w:t xml:space="preserve">选点问题还是轨迹预检问题； </w:t>
       </w:r>
     </w:p>
     <w:p>
@@ -13714,7 +13896,15 @@
       </w:pPr>
       <w:r>
         <w:rPr/>
-        <w:t xml:space="preserve">先写能复现问题的失败测试，再改实现； </w:t>
+        <w:t xml:space="preserve">验证小跳是低层跟踪、提前触地还是 </w:t>
+      </w:r>
+      <w:r>
+        <w:rPr/>
+        <w:t xml:space="preserve">Recovery </w:t>
+      </w:r>
+      <w:r>
+        <w:rPr/>
+        <w:t xml:space="preserve">事务问题； </w:t>
       </w:r>
     </w:p>
     <w:p>
@@ -13729,6 +13919,56 @@
           <w:tab w:val="left" w:pos="799" w:leader="none"/>
         </w:tabs>
         <w:bidi w:val="0"/>
+        <w:ind w:start="799" w:end="90" w:hanging="283"/>
+        <w:jc w:val="start"/>
+        <w:rPr/>
+      </w:pPr>
+      <w:r>
+        <w:rPr/>
+        <w:t xml:space="preserve">最后再考虑修改奖励权重或网络结构。 </w:t>
+      </w:r>
+    </w:p>
+    <w:p>
+      <w:pPr>
+        <w:pStyle w:val="HorizontalLine"/>
+        <w:bidi w:val="0"/>
+        <w:jc w:val="start"/>
+        <w:rPr/>
+      </w:pPr>
+      <w:r>
+        <w:rPr/>
+      </w:r>
+    </w:p>
+    <w:p>
+      <w:pPr>
+        <w:pStyle w:val="Heading2"/>
+        <w:bidi w:val="0"/>
+        <w:jc w:val="start"/>
+        <w:rPr/>
+      </w:pPr>
+      <w:bookmarkStart w:id="53" w:name="14-修改代码时的硬性规则"/>
+      <w:bookmarkEnd w:id="53"/>
+      <w:r>
+        <w:rPr/>
+        <w:t xml:space="preserve">14. </w:t>
+      </w:r>
+      <w:r>
+        <w:rPr/>
+        <w:t>修改代码时的硬性规则</w:t>
+      </w:r>
+    </w:p>
+    <w:p>
+      <w:pPr>
+        <w:pStyle w:val="TextBody"/>
+        <w:numPr>
+          <w:ilvl w:val="0"/>
+          <w:numId w:val="30"/>
+        </w:numPr>
+        <w:tabs>
+          <w:tab w:val="clear" w:pos="1134"/>
+          <w:tab w:val="left" w:pos="799" w:leader="none"/>
+        </w:tabs>
+        <w:bidi w:val="0"/>
         <w:spacing w:before="90" w:after="0"/>
         <w:ind w:start="799" w:end="90" w:hanging="283"/>
         <w:jc w:val="start"/>
@@ -13736,15 +13976,7 @@
       </w:pPr>
       <w:r>
         <w:rPr/>
-        <w:t xml:space="preserve">世界高度查询必须使用世界 </w:t>
-      </w:r>
-      <w:r>
-        <w:rPr/>
-        <w:t>XY</w:t>
-      </w:r>
-      <w:r>
-        <w:rPr/>
-        <w:t xml:space="preserve">； </w:t>
+        <w:t xml:space="preserve">先读当前源码，不以聊天记忆或旧文档代替； </w:t>
       </w:r>
     </w:p>
     <w:p>
@@ -13752,7 +13984,7 @@
         <w:pStyle w:val="TextBody"/>
         <w:numPr>
           <w:ilvl w:val="0"/>
-          <w:numId w:val="29"/>
+          <w:numId w:val="30"/>
         </w:numPr>
         <w:tabs>
           <w:tab w:val="clear" w:pos="1134"/>
@@ -13766,15 +13998,7 @@
       </w:pPr>
       <w:r>
         <w:rPr/>
-        <w:t xml:space="preserve">进入 </w:t>
-      </w:r>
-      <w:r>
-        <w:rPr/>
-        <w:t xml:space="preserve">SWING </w:t>
-      </w:r>
-      <w:r>
-        <w:rPr/>
-        <w:t xml:space="preserve">后不得改变支撑脚快照、朝向、轨迹起点、终点和最高点； </w:t>
+        <w:t xml:space="preserve">先写能复现问题的失败测试，再改实现； </w:t>
       </w:r>
     </w:p>
     <w:p>
@@ -13782,7 +14006,7 @@
         <w:pStyle w:val="TextBody"/>
         <w:numPr>
           <w:ilvl w:val="0"/>
-          <w:numId w:val="29"/>
+          <w:numId w:val="30"/>
         </w:numPr>
         <w:tabs>
           <w:tab w:val="clear" w:pos="1134"/>
@@ -13796,7 +14020,15 @@
       </w:pPr>
       <w:r>
         <w:rPr/>
-        <w:t xml:space="preserve">几何无效与安全分低必须分开，不能让软奖励绕过不可构造目标； </w:t>
+        <w:t xml:space="preserve">世界高度查询必须使用世界 </w:t>
+      </w:r>
+      <w:r>
+        <w:rPr/>
+        <w:t>XY</w:t>
+      </w:r>
+      <w:r>
+        <w:rPr/>
+        <w:t xml:space="preserve">； </w:t>
       </w:r>
     </w:p>
     <w:p>
@@ -13804,7 +14036,7 @@
         <w:pStyle w:val="TextBody"/>
         <w:numPr>
           <w:ilvl w:val="0"/>
-          <w:numId w:val="29"/>
+          <w:numId w:val="30"/>
         </w:numPr>
         <w:tabs>
           <w:tab w:val="clear" w:pos="1134"/>
@@ -13818,11 +14050,15 @@
       </w:pPr>
       <w:r>
         <w:rPr/>
-        <w:t xml:space="preserve">Planner </w:t>
-      </w:r>
-      <w:r>
-        <w:rPr/>
-        <w:t xml:space="preserve">事件一笔事务只记录一次，不要每个控制步重复评估； </w:t>
+        <w:t xml:space="preserve">进入 </w:t>
+      </w:r>
+      <w:r>
+        <w:rPr/>
+        <w:t xml:space="preserve">SWING </w:t>
+      </w:r>
+      <w:r>
+        <w:rPr/>
+        <w:t xml:space="preserve">后不得改变支撑脚快照、朝向、轨迹起点、终点和最高点； </w:t>
       </w:r>
     </w:p>
     <w:p>
@@ -13830,7 +14066,7 @@
         <w:pStyle w:val="TextBody"/>
         <w:numPr>
           <w:ilvl w:val="0"/>
-          <w:numId w:val="29"/>
+          <w:numId w:val="30"/>
         </w:numPr>
         <w:tabs>
           <w:tab w:val="clear" w:pos="1134"/>
@@ -13844,31 +14080,7 @@
       </w:pPr>
       <w:r>
         <w:rPr/>
-        <w:t xml:space="preserve">保持电机 </w:t>
-      </w:r>
-      <w:r>
-        <w:rPr/>
-        <w:t xml:space="preserve">PPO </w:t>
-      </w:r>
-      <w:r>
-        <w:rPr/>
-        <w:t>原始更新逻辑，</w:t>
-      </w:r>
-      <w:r>
-        <w:rPr/>
-        <w:t xml:space="preserve">Planner </w:t>
-      </w:r>
-      <w:r>
-        <w:rPr/>
-        <w:t xml:space="preserve">的独立更新不得反向污染电机 </w:t>
-      </w:r>
-      <w:r>
-        <w:rPr/>
-        <w:t>MoE</w:t>
-      </w:r>
-      <w:r>
-        <w:rPr/>
-        <w:t xml:space="preserve">； </w:t>
+        <w:t xml:space="preserve">几何无效与安全分低必须分开，不能让软奖励绕过不可构造目标； </w:t>
       </w:r>
     </w:p>
     <w:p>
@@ -13876,7 +14088,7 @@
         <w:pStyle w:val="TextBody"/>
         <w:numPr>
           <w:ilvl w:val="0"/>
-          <w:numId w:val="29"/>
+          <w:numId w:val="30"/>
         </w:numPr>
         <w:tabs>
           <w:tab w:val="clear" w:pos="1134"/>
@@ -13890,11 +14102,11 @@
       </w:pPr>
       <w:r>
         <w:rPr/>
-        <w:t xml:space="preserve">Play </w:t>
-      </w:r>
-      <w:r>
-        <w:rPr/>
-        <w:t xml:space="preserve">的可视化状态与实际路由状态要分开； </w:t>
+        <w:t xml:space="preserve">Planner </w:t>
+      </w:r>
+      <w:r>
+        <w:rPr/>
+        <w:t xml:space="preserve">事件一笔事务只记录一次，不要每个控制步重复评估； </w:t>
       </w:r>
     </w:p>
     <w:p>
@@ -13902,7 +14114,7 @@
         <w:pStyle w:val="TextBody"/>
         <w:numPr>
           <w:ilvl w:val="0"/>
-          <w:numId w:val="29"/>
+          <w:numId w:val="30"/>
         </w:numPr>
         <w:tabs>
           <w:tab w:val="clear" w:pos="1134"/>
@@ -13916,7 +14128,31 @@
       </w:pPr>
       <w:r>
         <w:rPr/>
-        <w:t xml:space="preserve">不要为了某一张截图增加只适用于台阶的隐藏规则； </w:t>
+        <w:t xml:space="preserve">保持电机 </w:t>
+      </w:r>
+      <w:r>
+        <w:rPr/>
+        <w:t xml:space="preserve">PPO </w:t>
+      </w:r>
+      <w:r>
+        <w:rPr/>
+        <w:t>原始更新逻辑，</w:t>
+      </w:r>
+      <w:r>
+        <w:rPr/>
+        <w:t xml:space="preserve">Planner </w:t>
+      </w:r>
+      <w:r>
+        <w:rPr/>
+        <w:t xml:space="preserve">的独立更新不得反向污染电机 </w:t>
+      </w:r>
+      <w:r>
+        <w:rPr/>
+        <w:t>MoE</w:t>
+      </w:r>
+      <w:r>
+        <w:rPr/>
+        <w:t xml:space="preserve">； </w:t>
       </w:r>
     </w:p>
     <w:p>
@@ -13924,7 +14160,55 @@
         <w:pStyle w:val="TextBody"/>
         <w:numPr>
           <w:ilvl w:val="0"/>
-          <w:numId w:val="29"/>
+          <w:numId w:val="30"/>
+        </w:numPr>
+        <w:tabs>
+          <w:tab w:val="clear" w:pos="1134"/>
+          <w:tab w:val="left" w:pos="799" w:leader="none"/>
+        </w:tabs>
+        <w:bidi w:val="0"/>
+        <w:spacing w:before="90" w:after="0"/>
+        <w:ind w:start="799" w:end="90" w:hanging="283"/>
+        <w:jc w:val="start"/>
+        <w:rPr/>
+      </w:pPr>
+      <w:r>
+        <w:rPr/>
+        <w:t xml:space="preserve">Play </w:t>
+      </w:r>
+      <w:r>
+        <w:rPr/>
+        <w:t xml:space="preserve">的可视化状态与实际路由状态要分开； </w:t>
+      </w:r>
+    </w:p>
+    <w:p>
+      <w:pPr>
+        <w:pStyle w:val="TextBody"/>
+        <w:numPr>
+          <w:ilvl w:val="0"/>
+          <w:numId w:val="30"/>
+        </w:numPr>
+        <w:tabs>
+          <w:tab w:val="clear" w:pos="1134"/>
+          <w:tab w:val="left" w:pos="799" w:leader="none"/>
+        </w:tabs>
+        <w:bidi w:val="0"/>
+        <w:spacing w:before="90" w:after="0"/>
+        <w:ind w:start="799" w:end="90" w:hanging="283"/>
+        <w:jc w:val="start"/>
+        <w:rPr/>
+      </w:pPr>
+      <w:r>
+        <w:rPr/>
+        <w:t xml:space="preserve">不要为了某一张截图增加只适用于台阶的隐藏规则； </w:t>
+      </w:r>
+    </w:p>
+    <w:p>
+      <w:pPr>
+        <w:pStyle w:val="TextBody"/>
+        <w:numPr>
+          <w:ilvl w:val="0"/>
+          <w:numId w:val="30"/>
         </w:numPr>
         <w:tabs>
           <w:tab w:val="clear" w:pos="1134"/>
@@ -15257,23 +15541,31 @@
       </w:r>
       <w:r>
         <w:rPr/>
-        <w:t xml:space="preserve">不要修改外部 </w:t>
-      </w:r>
-      <w:r>
-        <w:rPr/>
-        <w:t xml:space="preserve">Instinct-RL </w:t>
-      </w:r>
-      <w:r>
-        <w:rPr/>
-        <w:t xml:space="preserve">底层电机 </w:t>
-      </w:r>
-      <w:r>
-        <w:rPr/>
-        <w:t xml:space="preserve">PPO </w:t>
-      </w:r>
-      <w:r>
-        <w:rPr/>
-        <w:t>行为；</w:t>
+        <w:t xml:space="preserve">不要直接修改 </w:t>
+      </w:r>
+      <w:r>
+        <w:rPr/>
+        <w:t xml:space="preserve">`third_party/instinct_rl` </w:t>
+      </w:r>
+      <w:r>
+        <w:rPr/>
+        <w:t xml:space="preserve">中的底层电机 </w:t>
+      </w:r>
+      <w:r>
+        <w:rPr/>
+        <w:t>PPO</w:t>
+      </w:r>
+      <w:r>
+        <w:rPr/>
+        <w:t xml:space="preserve">；扩展应优先放在本项目 </w:t>
+      </w:r>
+      <w:r>
+        <w:rPr/>
+        <w:t>`source/instinctlab/instinctlab/learning/`</w:t>
+      </w:r>
+      <w:r>
+        <w:rPr/>
+        <w:t>；</w:t>
       </w:r>
     </w:p>
     <w:p>
@@ -15410,6 +15702,36 @@
       <w:r>
         <w:rPr/>
         <w:t>cd ~/InstinctLab-foothold</w:t>
+      </w:r>
+    </w:p>
+    <w:p>
+      <w:pPr>
+        <w:pStyle w:val="PreformattedText"/>
+        <w:keepLines/>
+        <w:shd w:val="clear" w:fill="111827"/>
+        <w:bidi w:val="0"/>
+        <w:spacing w:lineRule="auto" w:line="338" w:before="0" w:after="0"/>
+        <w:jc w:val="start"/>
+        <w:rPr/>
+      </w:pPr>
+      <w:r>
+        <w:rPr/>
+        <w:t>git submodule update --init --recursive</w:t>
+      </w:r>
+    </w:p>
+    <w:p>
+      <w:pPr>
+        <w:pStyle w:val="PreformattedText"/>
+        <w:keepLines/>
+        <w:shd w:val="clear" w:fill="111827"/>
+        <w:bidi w:val="0"/>
+        <w:spacing w:lineRule="auto" w:line="338" w:before="0" w:after="0"/>
+        <w:jc w:val="start"/>
+        <w:rPr/>
+      </w:pPr>
+      <w:r>
+        <w:rPr/>
+        <w:t>./scripts/bootstrap_foothold.sh --check-only</w:t>
       </w:r>
     </w:p>
     <w:p>
@@ -15630,7 +15952,7 @@
         <w:pStyle w:val="TextBody"/>
         <w:numPr>
           <w:ilvl w:val="0"/>
-          <w:numId w:val="30"/>
+          <w:numId w:val="31"/>
         </w:numPr>
         <w:tabs>
           <w:tab w:val="clear" w:pos="1134"/>
@@ -15668,7 +15990,7 @@
         <w:pStyle w:val="TextBody"/>
         <w:numPr>
           <w:ilvl w:val="0"/>
-          <w:numId w:val="30"/>
+          <w:numId w:val="31"/>
         </w:numPr>
         <w:tabs>
           <w:tab w:val="clear" w:pos="1134"/>
@@ -15714,7 +16036,7 @@
         <w:pStyle w:val="TextBody"/>
         <w:numPr>
           <w:ilvl w:val="0"/>
-          <w:numId w:val="30"/>
+          <w:numId w:val="31"/>
         </w:numPr>
         <w:tabs>
           <w:tab w:val="clear" w:pos="1134"/>
@@ -15740,7 +16062,7 @@
         <w:pStyle w:val="TextBody"/>
         <w:numPr>
           <w:ilvl w:val="0"/>
-          <w:numId w:val="30"/>
+          <w:numId w:val="31"/>
         </w:numPr>
         <w:tabs>
           <w:tab w:val="clear" w:pos="1134"/>
@@ -15774,7 +16096,7 @@
         <w:pStyle w:val="TextBody"/>
         <w:numPr>
           <w:ilvl w:val="0"/>
-          <w:numId w:val="30"/>
+          <w:numId w:val="31"/>
         </w:numPr>
         <w:tabs>
           <w:tab w:val="clear" w:pos="1134"/>
@@ -15816,7 +16138,7 @@
         <w:pStyle w:val="TextBody"/>
         <w:numPr>
           <w:ilvl w:val="0"/>
-          <w:numId w:val="30"/>
+          <w:numId w:val="31"/>
         </w:numPr>
         <w:tabs>
           <w:tab w:val="clear" w:pos="1134"/>
@@ -15846,7 +16168,7 @@
         <w:pStyle w:val="TextBody"/>
         <w:numPr>
           <w:ilvl w:val="0"/>
-          <w:numId w:val="30"/>
+          <w:numId w:val="31"/>
         </w:numPr>
         <w:tabs>
           <w:tab w:val="clear" w:pos="1134"/>
@@ -15872,7 +16194,7 @@
         <w:pStyle w:val="TextBody"/>
         <w:numPr>
           <w:ilvl w:val="0"/>
-          <w:numId w:val="30"/>
+          <w:numId w:val="31"/>
         </w:numPr>
         <w:tabs>
           <w:tab w:val="clear" w:pos="1134"/>
@@ -15914,7 +16236,7 @@
         <w:pStyle w:val="TextBody"/>
         <w:numPr>
           <w:ilvl w:val="0"/>
-          <w:numId w:val="30"/>
+          <w:numId w:val="31"/>
         </w:numPr>
         <w:tabs>
           <w:tab w:val="clear" w:pos="1134"/>
@@ -15940,7 +16262,7 @@
         <w:pStyle w:val="TextBody"/>
         <w:numPr>
           <w:ilvl w:val="0"/>
-          <w:numId w:val="30"/>
+          <w:numId w:val="31"/>
         </w:numPr>
         <w:tabs>
           <w:tab w:val="clear" w:pos="1134"/>
@@ -15990,7 +16312,7 @@
         <w:pStyle w:val="TextBody"/>
         <w:numPr>
           <w:ilvl w:val="0"/>
-          <w:numId w:val="30"/>
+          <w:numId w:val="31"/>
         </w:numPr>
         <w:tabs>
           <w:tab w:val="clear" w:pos="1134"/>
@@ -16013,64 +16335,6 @@
       <w:r>
         <w:rPr/>
         <w:t xml:space="preserve">单支撑事务已做专项日志验证； </w:t>
-      </w:r>
-    </w:p>
-    <w:p>
-      <w:pPr>
-        <w:pStyle w:val="TextBody"/>
-        <w:numPr>
-          <w:ilvl w:val="0"/>
-          <w:numId w:val="30"/>
-        </w:numPr>
-        <w:tabs>
-          <w:tab w:val="clear" w:pos="1134"/>
-          <w:tab w:val="left" w:pos="799" w:leader="none"/>
-        </w:tabs>
-        <w:bidi w:val="0"/>
-        <w:ind w:start="799" w:end="90" w:hanging="283"/>
-        <w:jc w:val="start"/>
-        <w:rPr/>
-      </w:pPr>
-      <w:r>
-        <w:rPr/>
-        <w:t xml:space="preserve">☐ </w:t>
-      </w:r>
-      <w:r>
-        <w:rPr/>
-        <w:t xml:space="preserve">实机安全验证前没有删除最终安全监督。 </w:t>
-      </w:r>
-    </w:p>
-    <w:p>
-      <w:pPr>
-        <w:pStyle w:val="HorizontalLine"/>
-        <w:bidi w:val="0"/>
-        <w:jc w:val="start"/>
-        <w:rPr/>
-      </w:pPr>
-      <w:r>
-        <w:rPr/>
-      </w:r>
-    </w:p>
-    <w:p>
-      <w:pPr>
-        <w:pStyle w:val="Heading2"/>
-        <w:bidi w:val="0"/>
-        <w:jc w:val="start"/>
-        <w:rPr/>
-      </w:pPr>
-      <w:bookmarkStart w:id="56" w:name="附录-A-相关文档"/>
-      <w:bookmarkEnd w:id="56"/>
-      <w:r>
-        <w:rPr/>
-        <w:t xml:space="preserve">附录 </w:t>
-      </w:r>
-      <w:r>
-        <w:rPr/>
-        <w:t>A</w:t>
-      </w:r>
-      <w:r>
-        <w:rPr/>
-        <w:t>：相关文档</w:t>
       </w:r>
     </w:p>
     <w:p>
@@ -16085,6 +16349,64 @@
           <w:tab w:val="left" w:pos="799" w:leader="none"/>
         </w:tabs>
         <w:bidi w:val="0"/>
+        <w:ind w:start="799" w:end="90" w:hanging="283"/>
+        <w:jc w:val="start"/>
+        <w:rPr/>
+      </w:pPr>
+      <w:r>
+        <w:rPr/>
+        <w:t xml:space="preserve">☐ </w:t>
+      </w:r>
+      <w:r>
+        <w:rPr/>
+        <w:t xml:space="preserve">实机安全验证前没有删除最终安全监督。 </w:t>
+      </w:r>
+    </w:p>
+    <w:p>
+      <w:pPr>
+        <w:pStyle w:val="HorizontalLine"/>
+        <w:bidi w:val="0"/>
+        <w:jc w:val="start"/>
+        <w:rPr/>
+      </w:pPr>
+      <w:r>
+        <w:rPr/>
+      </w:r>
+    </w:p>
+    <w:p>
+      <w:pPr>
+        <w:pStyle w:val="Heading2"/>
+        <w:bidi w:val="0"/>
+        <w:jc w:val="start"/>
+        <w:rPr/>
+      </w:pPr>
+      <w:bookmarkStart w:id="56" w:name="附录-A-相关文档"/>
+      <w:bookmarkEnd w:id="56"/>
+      <w:r>
+        <w:rPr/>
+        <w:t xml:space="preserve">附录 </w:t>
+      </w:r>
+      <w:r>
+        <w:rPr/>
+        <w:t>A</w:t>
+      </w:r>
+      <w:r>
+        <w:rPr/>
+        <w:t>：相关文档</w:t>
+      </w:r>
+    </w:p>
+    <w:p>
+      <w:pPr>
+        <w:pStyle w:val="TextBody"/>
+        <w:numPr>
+          <w:ilvl w:val="0"/>
+          <w:numId w:val="32"/>
+        </w:numPr>
+        <w:tabs>
+          <w:tab w:val="clear" w:pos="1134"/>
+          <w:tab w:val="left" w:pos="799" w:leader="none"/>
+        </w:tabs>
+        <w:bidi w:val="0"/>
         <w:spacing w:before="90" w:after="0"/>
         <w:ind w:start="799" w:end="90" w:hanging="283"/>
         <w:jc w:val="start"/>
@@ -16106,7 +16428,7 @@
         <w:pStyle w:val="TextBody"/>
         <w:numPr>
           <w:ilvl w:val="0"/>
-          <w:numId w:val="31"/>
+          <w:numId w:val="32"/>
         </w:numPr>
         <w:tabs>
           <w:tab w:val="clear" w:pos="1134"/>
@@ -16150,7 +16472,7 @@
         <w:pStyle w:val="TextBody"/>
         <w:numPr>
           <w:ilvl w:val="0"/>
-          <w:numId w:val="31"/>
+          <w:numId w:val="32"/>
         </w:numPr>
         <w:tabs>
           <w:tab w:val="clear" w:pos="1134"/>
@@ -16178,7 +16500,7 @@
         <w:pStyle w:val="TextBody"/>
         <w:numPr>
           <w:ilvl w:val="0"/>
-          <w:numId w:val="31"/>
+          <w:numId w:val="32"/>
         </w:numPr>
         <w:tabs>
           <w:tab w:val="clear" w:pos="1134"/>
@@ -16206,7 +16528,7 @@
         <w:pStyle w:val="TextBody"/>
         <w:numPr>
           <w:ilvl w:val="0"/>
-          <w:numId w:val="31"/>
+          <w:numId w:val="32"/>
         </w:numPr>
         <w:tabs>
           <w:tab w:val="clear" w:pos="1134"/>
@@ -16234,7 +16556,7 @@
         <w:pStyle w:val="TextBody"/>
         <w:numPr>
           <w:ilvl w:val="0"/>
-          <w:numId w:val="31"/>
+          <w:numId w:val="32"/>
         </w:numPr>
         <w:tabs>
           <w:tab w:val="clear" w:pos="1134"/>
@@ -16270,7 +16592,7 @@
         <w:pStyle w:val="TextBody"/>
         <w:numPr>
           <w:ilvl w:val="0"/>
-          <w:numId w:val="31"/>
+          <w:numId w:val="32"/>
         </w:numPr>
         <w:tabs>
           <w:tab w:val="clear" w:pos="1134"/>
@@ -16319,7 +16641,7 @@
         <w:pStyle w:val="TextBody"/>
         <w:numPr>
           <w:ilvl w:val="0"/>
-          <w:numId w:val="32"/>
+          <w:numId w:val="33"/>
         </w:numPr>
         <w:tabs>
           <w:tab w:val="clear" w:pos="1134"/>
@@ -16347,7 +16669,7 @@
         <w:pStyle w:val="TextBody"/>
         <w:numPr>
           <w:ilvl w:val="0"/>
-          <w:numId w:val="32"/>
+          <w:numId w:val="33"/>
         </w:numPr>
         <w:tabs>
           <w:tab w:val="clear" w:pos="1134"/>
@@ -16375,7 +16697,7 @@
         <w:pStyle w:val="TextBody"/>
         <w:numPr>
           <w:ilvl w:val="0"/>
-          <w:numId w:val="32"/>
+          <w:numId w:val="33"/>
         </w:numPr>
         <w:tabs>
           <w:tab w:val="clear" w:pos="1134"/>
@@ -19870,8 +20192,8 @@
   <w:abstractNum w:abstractNumId="26">
     <w:lvl w:ilvl="0">
       <w:start w:val="1"/>
-      <w:numFmt w:val="decimal"/>
-      <w:lvlText w:val="%1."/>
+      <w:numFmt w:val="bullet"/>
+      <w:lvlText w:val=""/>
       <w:lvlJc w:val="start"/>
       <w:pPr>
         <w:tabs>
@@ -19879,12 +20201,14 @@
         </w:tabs>
         <w:ind w:start="709" w:hanging="283"/>
       </w:pPr>
-      <w:rPr/>
+      <w:rPr>
+        <w:rFonts w:ascii="Symbol" w:hAnsi="Symbol" w:cs="Symbol" w:hint="default"/>
+      </w:rPr>
     </w:lvl>
     <w:lvl w:ilvl="1">
       <w:start w:val="1"/>
-      <w:numFmt w:val="decimal"/>
-      <w:lvlText w:val="%2."/>
+      <w:numFmt w:val="bullet"/>
+      <w:lvlText w:val=""/>
       <w:lvlJc w:val="start"/>
       <w:pPr>
         <w:tabs>
@@ -19892,12 +20216,14 @@
         </w:tabs>
         <w:ind w:start="1418" w:hanging="283"/>
       </w:pPr>
-      <w:rPr/>
+      <w:rPr>
+        <w:rFonts w:ascii="Symbol" w:hAnsi="Symbol" w:cs="Symbol" w:hint="default"/>
+      </w:rPr>
     </w:lvl>
     <w:lvl w:ilvl="2">
       <w:start w:val="1"/>
-      <w:numFmt w:val="decimal"/>
-      <w:lvlText w:val="%3."/>
+      <w:numFmt w:val="bullet"/>
+      <w:lvlText w:val=""/>
       <w:lvlJc w:val="start"/>
       <w:pPr>
         <w:tabs>
@@ -19905,12 +20231,14 @@
         </w:tabs>
         <w:ind w:start="2127" w:hanging="283"/>
       </w:pPr>
-      <w:rPr/>
+      <w:rPr>
+        <w:rFonts w:ascii="Symbol" w:hAnsi="Symbol" w:cs="Symbol" w:hint="default"/>
+      </w:rPr>
     </w:lvl>
     <w:lvl w:ilvl="3">
       <w:start w:val="1"/>
-      <w:numFmt w:val="decimal"/>
-      <w:lvlText w:val="%4."/>
+      <w:numFmt w:val="bullet"/>
+      <w:lvlText w:val=""/>
       <w:lvlJc w:val="start"/>
       <w:pPr>
         <w:tabs>
@@ -19918,12 +20246,14 @@
         </w:tabs>
         <w:ind w:start="2836" w:hanging="283"/>
       </w:pPr>
-      <w:rPr/>
+      <w:rPr>
+        <w:rFonts w:ascii="Symbol" w:hAnsi="Symbol" w:cs="Symbol" w:hint="default"/>
+      </w:rPr>
     </w:lvl>
     <w:lvl w:ilvl="4">
       <w:start w:val="1"/>
-      <w:numFmt w:val="decimal"/>
-      <w:lvlText w:val="%5."/>
+      <w:numFmt w:val="bullet"/>
+      <w:lvlText w:val=""/>
       <w:lvlJc w:val="start"/>
       <w:pPr>
         <w:tabs>
@@ -19931,12 +20261,14 @@
         </w:tabs>
         <w:ind w:start="3545" w:hanging="283"/>
       </w:pPr>
-      <w:rPr/>
+      <w:rPr>
+        <w:rFonts w:ascii="Symbol" w:hAnsi="Symbol" w:cs="Symbol" w:hint="default"/>
+      </w:rPr>
     </w:lvl>
     <w:lvl w:ilvl="5">
       <w:start w:val="1"/>
-      <w:numFmt w:val="decimal"/>
-      <w:lvlText w:val="%6."/>
+      <w:numFmt w:val="bullet"/>
+      <w:lvlText w:val=""/>
       <w:lvlJc w:val="start"/>
       <w:pPr>
         <w:tabs>
@@ -19944,12 +20276,14 @@
         </w:tabs>
         <w:ind w:start="4254" w:hanging="283"/>
       </w:pPr>
-      <w:rPr/>
+      <w:rPr>
+        <w:rFonts w:ascii="Symbol" w:hAnsi="Symbol" w:cs="Symbol" w:hint="default"/>
+      </w:rPr>
     </w:lvl>
     <w:lvl w:ilvl="6">
       <w:start w:val="1"/>
-      <w:numFmt w:val="decimal"/>
-      <w:lvlText w:val="%7."/>
+      <w:numFmt w:val="bullet"/>
+      <w:lvlText w:val=""/>
       <w:lvlJc w:val="start"/>
       <w:pPr>
         <w:tabs>
@@ -19957,12 +20291,14 @@
         </w:tabs>
         <w:ind w:start="4963" w:hanging="283"/>
       </w:pPr>
-      <w:rPr/>
+      <w:rPr>
+        <w:rFonts w:ascii="Symbol" w:hAnsi="Symbol" w:cs="Symbol" w:hint="default"/>
+      </w:rPr>
     </w:lvl>
     <w:lvl w:ilvl="7">
       <w:start w:val="1"/>
-      <w:numFmt w:val="decimal"/>
-      <w:lvlText w:val="%8."/>
+      <w:numFmt w:val="bullet"/>
+      <w:lvlText w:val=""/>
       <w:lvlJc w:val="start"/>
       <w:pPr>
         <w:tabs>
@@ -19970,12 +20306,14 @@
         </w:tabs>
         <w:ind w:start="5672" w:hanging="283"/>
       </w:pPr>
-      <w:rPr/>
+      <w:rPr>
+        <w:rFonts w:ascii="Symbol" w:hAnsi="Symbol" w:cs="Symbol" w:hint="default"/>
+      </w:rPr>
     </w:lvl>
     <w:lvl w:ilvl="8">
       <w:start w:val="1"/>
-      <w:numFmt w:val="decimal"/>
-      <w:lvlText w:val="%9."/>
+      <w:numFmt w:val="bullet"/>
+      <w:lvlText w:val=""/>
       <w:lvlJc w:val="start"/>
       <w:pPr>
         <w:tabs>
@@ -19983,14 +20321,16 @@
         </w:tabs>
         <w:ind w:start="6381" w:hanging="283"/>
       </w:pPr>
-      <w:rPr/>
+      <w:rPr>
+        <w:rFonts w:ascii="Symbol" w:hAnsi="Symbol" w:cs="Symbol" w:hint="default"/>
+      </w:rPr>
     </w:lvl>
   </w:abstractNum>
   <w:abstractNum w:abstractNumId="27">
     <w:lvl w:ilvl="0">
       <w:start w:val="1"/>
-      <w:numFmt w:val="bullet"/>
-      <w:lvlText w:val=""/>
+      <w:numFmt w:val="decimal"/>
+      <w:lvlText w:val="%1."/>
       <w:lvlJc w:val="start"/>
       <w:pPr>
         <w:tabs>
@@ -19998,14 +20338,12 @@
         </w:tabs>
         <w:ind w:start="709" w:hanging="283"/>
       </w:pPr>
-      <w:rPr>
-        <w:rFonts w:ascii="Symbol" w:hAnsi="Symbol" w:cs="Symbol" w:hint="default"/>
-      </w:rPr>
+      <w:rPr/>
     </w:lvl>
     <w:lvl w:ilvl="1">
       <w:start w:val="1"/>
-      <w:numFmt w:val="bullet"/>
-      <w:lvlText w:val=""/>
+      <w:numFmt w:val="decimal"/>
+      <w:lvlText w:val="%2."/>
       <w:lvlJc w:val="start"/>
       <w:pPr>
         <w:tabs>
@@ -20013,14 +20351,12 @@
         </w:tabs>
         <w:ind w:start="1418" w:hanging="283"/>
       </w:pPr>
-      <w:rPr>
-        <w:rFonts w:ascii="Symbol" w:hAnsi="Symbol" w:cs="Symbol" w:hint="default"/>
-      </w:rPr>
+      <w:rPr/>
     </w:lvl>
     <w:lvl w:ilvl="2">
       <w:start w:val="1"/>
-      <w:numFmt w:val="bullet"/>
-      <w:lvlText w:val=""/>
+      <w:numFmt w:val="decimal"/>
+      <w:lvlText w:val="%3."/>
       <w:lvlJc w:val="start"/>
       <w:pPr>
         <w:tabs>
@@ -20028,14 +20364,12 @@
         </w:tabs>
         <w:ind w:start="2127" w:hanging="283"/>
       </w:pPr>
-      <w:rPr>
-        <w:rFonts w:ascii="Symbol" w:hAnsi="Symbol" w:cs="Symbol" w:hint="default"/>
-      </w:rPr>
+      <w:rPr/>
     </w:lvl>
     <w:lvl w:ilvl="3">
       <w:start w:val="1"/>
-      <w:numFmt w:val="bullet"/>
-      <w:lvlText w:val=""/>
+      <w:numFmt w:val="decimal"/>
+      <w:lvlText w:val="%4."/>
       <w:lvlJc w:val="start"/>
       <w:pPr>
         <w:tabs>
@@ -20043,14 +20377,12 @@
         </w:tabs>
         <w:ind w:start="2836" w:hanging="283"/>
       </w:pPr>
-      <w:rPr>
-        <w:rFonts w:ascii="Symbol" w:hAnsi="Symbol" w:cs="Symbol" w:hint="default"/>
-      </w:rPr>
+      <w:rPr/>
     </w:lvl>
     <w:lvl w:ilvl="4">
       <w:start w:val="1"/>
-      <w:numFmt w:val="bullet"/>
-      <w:lvlText w:val=""/>
+      <w:numFmt w:val="decimal"/>
+      <w:lvlText w:val="%5."/>
       <w:lvlJc w:val="start"/>
       <w:pPr>
         <w:tabs>
@@ -20058,14 +20390,12 @@
         </w:tabs>
         <w:ind w:start="3545" w:hanging="283"/>
       </w:pPr>
-      <w:rPr>
-        <w:rFonts w:ascii="Symbol" w:hAnsi="Symbol" w:cs="Symbol" w:hint="default"/>
-      </w:rPr>
+      <w:rPr/>
     </w:lvl>
     <w:lvl w:ilvl="5">
       <w:start w:val="1"/>
-      <w:numFmt w:val="bullet"/>
-      <w:lvlText w:val=""/>
+      <w:numFmt w:val="decimal"/>
+      <w:lvlText w:val="%6."/>
       <w:lvlJc w:val="start"/>
       <w:pPr>
         <w:tabs>
@@ -20073,14 +20403,12 @@
         </w:tabs>
         <w:ind w:start="4254" w:hanging="283"/>
       </w:pPr>
-      <w:rPr>
-        <w:rFonts w:ascii="Symbol" w:hAnsi="Symbol" w:cs="Symbol" w:hint="default"/>
-      </w:rPr>
+      <w:rPr/>
     </w:lvl>
     <w:lvl w:ilvl="6">
       <w:start w:val="1"/>
-      <w:numFmt w:val="bullet"/>
-      <w:lvlText w:val=""/>
+      <w:numFmt w:val="decimal"/>
+      <w:lvlText w:val="%7."/>
       <w:lvlJc w:val="start"/>
       <w:pPr>
         <w:tabs>
@@ -20088,14 +20416,12 @@
         </w:tabs>
         <w:ind w:start="4963" w:hanging="283"/>
       </w:pPr>
-      <w:rPr>
-        <w:rFonts w:ascii="Symbol" w:hAnsi="Symbol" w:cs="Symbol" w:hint="default"/>
-      </w:rPr>
+      <w:rPr/>
     </w:lvl>
     <w:lvl w:ilvl="7">
       <w:start w:val="1"/>
-      <w:numFmt w:val="bullet"/>
-      <w:lvlText w:val=""/>
+      <w:numFmt w:val="decimal"/>
+      <w:lvlText w:val="%8."/>
       <w:lvlJc w:val="start"/>
       <w:pPr>
         <w:tabs>
@@ -20103,14 +20429,12 @@
         </w:tabs>
         <w:ind w:start="5672" w:hanging="283"/>
       </w:pPr>
-      <w:rPr>
-        <w:rFonts w:ascii="Symbol" w:hAnsi="Symbol" w:cs="Symbol" w:hint="default"/>
-      </w:rPr>
+      <w:rPr/>
     </w:lvl>
     <w:lvl w:ilvl="8">
       <w:start w:val="1"/>
-      <w:numFmt w:val="bullet"/>
-      <w:lvlText w:val=""/>
+      <w:numFmt w:val="decimal"/>
+      <w:lvlText w:val="%9."/>
       <w:lvlJc w:val="start"/>
       <w:pPr>
         <w:tabs>
@@ -20118,16 +20442,14 @@
         </w:tabs>
         <w:ind w:start="6381" w:hanging="283"/>
       </w:pPr>
-      <w:rPr>
-        <w:rFonts w:ascii="Symbol" w:hAnsi="Symbol" w:cs="Symbol" w:hint="default"/>
-      </w:rPr>
+      <w:rPr/>
     </w:lvl>
   </w:abstractNum>
   <w:abstractNum w:abstractNumId="28">
     <w:lvl w:ilvl="0">
       <w:start w:val="1"/>
-      <w:numFmt w:val="decimal"/>
-      <w:lvlText w:val="%1."/>
+      <w:numFmt w:val="bullet"/>
+      <w:lvlText w:val=""/>
       <w:lvlJc w:val="start"/>
       <w:pPr>
         <w:tabs>
@@ -20135,12 +20457,14 @@
         </w:tabs>
         <w:ind w:start="709" w:hanging="283"/>
       </w:pPr>
-      <w:rPr/>
+      <w:rPr>
+        <w:rFonts w:ascii="Symbol" w:hAnsi="Symbol" w:cs="Symbol" w:hint="default"/>
+      </w:rPr>
     </w:lvl>
     <w:lvl w:ilvl="1">
       <w:start w:val="1"/>
-      <w:numFmt w:val="decimal"/>
-      <w:lvlText w:val="%2."/>
+      <w:numFmt w:val="bullet"/>
+      <w:lvlText w:val=""/>
       <w:lvlJc w:val="start"/>
       <w:pPr>
         <w:tabs>
@@ -20148,12 +20472,14 @@
         </w:tabs>
         <w:ind w:start="1418" w:hanging="283"/>
       </w:pPr>
-      <w:rPr/>
+      <w:rPr>
+        <w:rFonts w:ascii="Symbol" w:hAnsi="Symbol" w:cs="Symbol" w:hint="default"/>
+      </w:rPr>
     </w:lvl>
     <w:lvl w:ilvl="2">
       <w:start w:val="1"/>
-      <w:numFmt w:val="decimal"/>
-      <w:lvlText w:val="%3."/>
+      <w:numFmt w:val="bullet"/>
+      <w:lvlText w:val=""/>
       <w:lvlJc w:val="start"/>
       <w:pPr>
         <w:tabs>
@@ -20161,12 +20487,14 @@
         </w:tabs>
         <w:ind w:start="2127" w:hanging="283"/>
       </w:pPr>
-      <w:rPr/>
+      <w:rPr>
+        <w:rFonts w:ascii="Symbol" w:hAnsi="Symbol" w:cs="Symbol" w:hint="default"/>
+      </w:rPr>
     </w:lvl>
     <w:lvl w:ilvl="3">
       <w:start w:val="1"/>
-      <w:numFmt w:val="decimal"/>
-      <w:lvlText w:val="%4."/>
+      <w:numFmt w:val="bullet"/>
+      <w:lvlText w:val=""/>
       <w:lvlJc w:val="start"/>
       <w:pPr>
         <w:tabs>
@@ -20174,12 +20502,14 @@
         </w:tabs>
         <w:ind w:start="2836" w:hanging="283"/>
       </w:pPr>
-      <w:rPr/>
+      <w:rPr>
+        <w:rFonts w:ascii="Symbol" w:hAnsi="Symbol" w:cs="Symbol" w:hint="default"/>
+      </w:rPr>
     </w:lvl>
     <w:lvl w:ilvl="4">
       <w:start w:val="1"/>
-      <w:numFmt w:val="decimal"/>
-      <w:lvlText w:val="%5."/>
+      <w:numFmt w:val="bullet"/>
+      <w:lvlText w:val=""/>
       <w:lvlJc w:val="start"/>
       <w:pPr>
         <w:tabs>
@@ -20187,12 +20517,14 @@
         </w:tabs>
         <w:ind w:start="3545" w:hanging="283"/>
       </w:pPr>
-      <w:rPr/>
+      <w:rPr>
+        <w:rFonts w:ascii="Symbol" w:hAnsi="Symbol" w:cs="Symbol" w:hint="default"/>
+      </w:rPr>
     </w:lvl>
     <w:lvl w:ilvl="5">
       <w:start w:val="1"/>
-      <w:numFmt w:val="decimal"/>
-      <w:lvlText w:val="%6."/>
+      <w:numFmt w:val="bullet"/>
+      <w:lvlText w:val=""/>
       <w:lvlJc w:val="start"/>
       <w:pPr>
         <w:tabs>
@@ -20200,12 +20532,14 @@
         </w:tabs>
         <w:ind w:start="4254" w:hanging="283"/>
       </w:pPr>
-      <w:rPr/>
+      <w:rPr>
+        <w:rFonts w:ascii="Symbol" w:hAnsi="Symbol" w:cs="Symbol" w:hint="default"/>
+      </w:rPr>
     </w:lvl>
     <w:lvl w:ilvl="6">
       <w:start w:val="1"/>
-      <w:numFmt w:val="decimal"/>
-      <w:lvlText w:val="%7."/>
+      <w:numFmt w:val="bullet"/>
+      <w:lvlText w:val=""/>
       <w:lvlJc w:val="start"/>
       <w:pPr>
         <w:tabs>
@@ -20213,12 +20547,14 @@
         </w:tabs>
         <w:ind w:start="4963" w:hanging="283"/>
       </w:pPr>
-      <w:rPr/>
+      <w:rPr>
+        <w:rFonts w:ascii="Symbol" w:hAnsi="Symbol" w:cs="Symbol" w:hint="default"/>
+      </w:rPr>
     </w:lvl>
     <w:lvl w:ilvl="7">
       <w:start w:val="1"/>
-      <w:numFmt w:val="decimal"/>
-      <w:lvlText w:val="%8."/>
+      <w:numFmt w:val="bullet"/>
+      <w:lvlText w:val=""/>
       <w:lvlJc w:val="start"/>
       <w:pPr>
         <w:tabs>
@@ -20226,12 +20562,14 @@
         </w:tabs>
         <w:ind w:start="5672" w:hanging="283"/>
       </w:pPr>
-      <w:rPr/>
+      <w:rPr>
+        <w:rFonts w:ascii="Symbol" w:hAnsi="Symbol" w:cs="Symbol" w:hint="default"/>
+      </w:rPr>
     </w:lvl>
     <w:lvl w:ilvl="8">
       <w:start w:val="1"/>
-      <w:numFmt w:val="decimal"/>
-      <w:lvlText w:val="%9."/>
+      <w:numFmt w:val="bullet"/>
+      <w:lvlText w:val=""/>
       <w:lvlJc w:val="start"/>
       <w:pPr>
         <w:tabs>
@@ -20239,7 +20577,9 @@
         </w:tabs>
         <w:ind w:start="6381" w:hanging="283"/>
       </w:pPr>
-      <w:rPr/>
+      <w:rPr>
+        <w:rFonts w:ascii="Symbol" w:hAnsi="Symbol" w:cs="Symbol" w:hint="default"/>
+      </w:rPr>
     </w:lvl>
   </w:abstractNum>
   <w:abstractNum w:abstractNumId="29">
@@ -20364,8 +20704,8 @@
   <w:abstractNum w:abstractNumId="30">
     <w:lvl w:ilvl="0">
       <w:start w:val="1"/>
-      <w:numFmt w:val="bullet"/>
-      <w:lvlText w:val=""/>
+      <w:numFmt w:val="decimal"/>
+      <w:lvlText w:val="%1."/>
       <w:lvlJc w:val="start"/>
       <w:pPr>
         <w:tabs>
@@ -20373,14 +20713,12 @@
         </w:tabs>
         <w:ind w:start="709" w:hanging="283"/>
       </w:pPr>
-      <w:rPr>
-        <w:rFonts w:ascii="Symbol" w:hAnsi="Symbol" w:cs="Symbol" w:hint="default"/>
-      </w:rPr>
+      <w:rPr/>
     </w:lvl>
     <w:lvl w:ilvl="1">
       <w:start w:val="1"/>
-      <w:numFmt w:val="bullet"/>
-      <w:lvlText w:val=""/>
+      <w:numFmt w:val="decimal"/>
+      <w:lvlText w:val="%2."/>
       <w:lvlJc w:val="start"/>
       <w:pPr>
         <w:tabs>
@@ -20388,14 +20726,12 @@
         </w:tabs>
         <w:ind w:start="1418" w:hanging="283"/>
       </w:pPr>
-      <w:rPr>
-        <w:rFonts w:ascii="Symbol" w:hAnsi="Symbol" w:cs="Symbol" w:hint="default"/>
-      </w:rPr>
+      <w:rPr/>
     </w:lvl>
     <w:lvl w:ilvl="2">
       <w:start w:val="1"/>
-      <w:numFmt w:val="bullet"/>
-      <w:lvlText w:val=""/>
+      <w:numFmt w:val="decimal"/>
+      <w:lvlText w:val="%3."/>
       <w:lvlJc w:val="start"/>
       <w:pPr>
         <w:tabs>
@@ -20403,14 +20739,12 @@
         </w:tabs>
         <w:ind w:start="2127" w:hanging="283"/>
       </w:pPr>
-      <w:rPr>
-        <w:rFonts w:ascii="Symbol" w:hAnsi="Symbol" w:cs="Symbol" w:hint="default"/>
-      </w:rPr>
+      <w:rPr/>
     </w:lvl>
     <w:lvl w:ilvl="3">
       <w:start w:val="1"/>
-      <w:numFmt w:val="bullet"/>
-      <w:lvlText w:val=""/>
+      <w:numFmt w:val="decimal"/>
+      <w:lvlText w:val="%4."/>
       <w:lvlJc w:val="start"/>
       <w:pPr>
         <w:tabs>
@@ -20418,14 +20752,12 @@
         </w:tabs>
         <w:ind w:start="2836" w:hanging="283"/>
       </w:pPr>
-      <w:rPr>
-        <w:rFonts w:ascii="Symbol" w:hAnsi="Symbol" w:cs="Symbol" w:hint="default"/>
-      </w:rPr>
+      <w:rPr/>
     </w:lvl>
     <w:lvl w:ilvl="4">
       <w:start w:val="1"/>
-      <w:numFmt w:val="bullet"/>
-      <w:lvlText w:val=""/>
+      <w:numFmt w:val="decimal"/>
+      <w:lvlText w:val="%5."/>
       <w:lvlJc w:val="start"/>
       <w:pPr>
         <w:tabs>
@@ -20433,14 +20765,12 @@
         </w:tabs>
         <w:ind w:start="3545" w:hanging="283"/>
       </w:pPr>
-      <w:rPr>
-        <w:rFonts w:ascii="Symbol" w:hAnsi="Symbol" w:cs="Symbol" w:hint="default"/>
-      </w:rPr>
+      <w:rPr/>
     </w:lvl>
     <w:lvl w:ilvl="5">
       <w:start w:val="1"/>
-      <w:numFmt w:val="bullet"/>
-      <w:lvlText w:val=""/>
+      <w:numFmt w:val="decimal"/>
+      <w:lvlText w:val="%6."/>
       <w:lvlJc w:val="start"/>
       <w:pPr>
         <w:tabs>
@@ -20448,14 +20778,12 @@
         </w:tabs>
         <w:ind w:start="4254" w:hanging="283"/>
       </w:pPr>
-      <w:rPr>
-        <w:rFonts w:ascii="Symbol" w:hAnsi="Symbol" w:cs="Symbol" w:hint="default"/>
-      </w:rPr>
+      <w:rPr/>
     </w:lvl>
     <w:lvl w:ilvl="6">
       <w:start w:val="1"/>
-      <w:numFmt w:val="bullet"/>
-      <w:lvlText w:val=""/>
+      <w:numFmt w:val="decimal"/>
+      <w:lvlText w:val="%7."/>
       <w:lvlJc w:val="start"/>
       <w:pPr>
         <w:tabs>
@@ -20463,14 +20791,12 @@
         </w:tabs>
         <w:ind w:start="4963" w:hanging="283"/>
       </w:pPr>
-      <w:rPr>
-        <w:rFonts w:ascii="Symbol" w:hAnsi="Symbol" w:cs="Symbol" w:hint="default"/>
-      </w:rPr>
+      <w:rPr/>
     </w:lvl>
     <w:lvl w:ilvl="7">
       <w:start w:val="1"/>
-      <w:numFmt w:val="bullet"/>
-      <w:lvlText w:val=""/>
+      <w:numFmt w:val="decimal"/>
+      <w:lvlText w:val="%8."/>
       <w:lvlJc w:val="start"/>
       <w:pPr>
         <w:tabs>
@@ -20478,14 +20804,12 @@
         </w:tabs>
         <w:ind w:start="5672" w:hanging="283"/>
       </w:pPr>
-      <w:rPr>
-        <w:rFonts w:ascii="Symbol" w:hAnsi="Symbol" w:cs="Symbol" w:hint="default"/>
-      </w:rPr>
+      <w:rPr/>
     </w:lvl>
     <w:lvl w:ilvl="8">
       <w:start w:val="1"/>
-      <w:numFmt w:val="bullet"/>
-      <w:lvlText w:val=""/>
+      <w:numFmt w:val="decimal"/>
+      <w:lvlText w:val="%9."/>
       <w:lvlJc w:val="start"/>
       <w:pPr>
         <w:tabs>
@@ -20493,9 +20817,7 @@
         </w:tabs>
         <w:ind w:start="6381" w:hanging="283"/>
       </w:pPr>
-      <w:rPr>
-        <w:rFonts w:ascii="Symbol" w:hAnsi="Symbol" w:cs="Symbol" w:hint="default"/>
-      </w:rPr>
+      <w:rPr/>
     </w:lvl>
   </w:abstractNum>
   <w:abstractNum w:abstractNumId="31">
@@ -20773,6 +21095,143 @@
     </w:lvl>
   </w:abstractNum>
   <w:abstractNum w:abstractNumId="33">
+    <w:lvl w:ilvl="0">
+      <w:start w:val="1"/>
+      <w:numFmt w:val="bullet"/>
+      <w:lvlText w:val=""/>
+      <w:lvlJc w:val="start"/>
+      <w:pPr>
+        <w:tabs>
+          <w:tab w:val="num" w:pos="709"/>
+        </w:tabs>
+        <w:ind w:start="709" w:hanging="283"/>
+      </w:pPr>
+      <w:rPr>
+        <w:rFonts w:ascii="Symbol" w:hAnsi="Symbol" w:cs="Symbol" w:hint="default"/>
+      </w:rPr>
+    </w:lvl>
+    <w:lvl w:ilvl="1">
+      <w:start w:val="1"/>
+      <w:numFmt w:val="bullet"/>
+      <w:lvlText w:val=""/>
+      <w:lvlJc w:val="start"/>
+      <w:pPr>
+        <w:tabs>
+          <w:tab w:val="num" w:pos="1418"/>
+        </w:tabs>
+        <w:ind w:start="1418" w:hanging="283"/>
+      </w:pPr>
+      <w:rPr>
+        <w:rFonts w:ascii="Symbol" w:hAnsi="Symbol" w:cs="Symbol" w:hint="default"/>
+      </w:rPr>
+    </w:lvl>
+    <w:lvl w:ilvl="2">
+      <w:start w:val="1"/>
+      <w:numFmt w:val="bullet"/>
+      <w:lvlText w:val=""/>
+      <w:lvlJc w:val="start"/>
+      <w:pPr>
+        <w:tabs>
+          <w:tab w:val="num" w:pos="2127"/>
+        </w:tabs>
+        <w:ind w:start="2127" w:hanging="283"/>
+      </w:pPr>
+      <w:rPr>
+        <w:rFonts w:ascii="Symbol" w:hAnsi="Symbol" w:cs="Symbol" w:hint="default"/>
+      </w:rPr>
+    </w:lvl>
+    <w:lvl w:ilvl="3">
+      <w:start w:val="1"/>
+      <w:numFmt w:val="bullet"/>
+      <w:lvlText w:val=""/>
+      <w:lvlJc w:val="start"/>
+      <w:pPr>
+        <w:tabs>
+          <w:tab w:val="num" w:pos="2836"/>
+        </w:tabs>
+        <w:ind w:start="2836" w:hanging="283"/>
+      </w:pPr>
+      <w:rPr>
+        <w:rFonts w:ascii="Symbol" w:hAnsi="Symbol" w:cs="Symbol" w:hint="default"/>
+      </w:rPr>
+    </w:lvl>
+    <w:lvl w:ilvl="4">
+      <w:start w:val="1"/>
+      <w:numFmt w:val="bullet"/>
+      <w:lvlText w:val=""/>
+      <w:lvlJc w:val="start"/>
+      <w:pPr>
+        <w:tabs>
+          <w:tab w:val="num" w:pos="3545"/>
+        </w:tabs>
+        <w:ind w:start="3545" w:hanging="283"/>
+      </w:pPr>
+      <w:rPr>
+        <w:rFonts w:ascii="Symbol" w:hAnsi="Symbol" w:cs="Symbol" w:hint="default"/>
+      </w:rPr>
+    </w:lvl>
+    <w:lvl w:ilvl="5">
+      <w:start w:val="1"/>
+      <w:numFmt w:val="bullet"/>
+      <w:lvlText w:val=""/>
+      <w:lvlJc w:val="start"/>
+      <w:pPr>
+        <w:tabs>
+          <w:tab w:val="num" w:pos="4254"/>
+        </w:tabs>
+        <w:ind w:start="4254" w:hanging="283"/>
+      </w:pPr>
+      <w:rPr>
+        <w:rFonts w:ascii="Symbol" w:hAnsi="Symbol" w:cs="Symbol" w:hint="default"/>
+      </w:rPr>
+    </w:lvl>
+    <w:lvl w:ilvl="6">
+      <w:start w:val="1"/>
+      <w:numFmt w:val="bullet"/>
+      <w:lvlText w:val=""/>
+      <w:lvlJc w:val="start"/>
+      <w:pPr>
+        <w:tabs>
+          <w:tab w:val="num" w:pos="4963"/>
+        </w:tabs>
+        <w:ind w:start="4963" w:hanging="283"/>
+      </w:pPr>
+      <w:rPr>
+        <w:rFonts w:ascii="Symbol" w:hAnsi="Symbol" w:cs="Symbol" w:hint="default"/>
+      </w:rPr>
+    </w:lvl>
+    <w:lvl w:ilvl="7">
+      <w:start w:val="1"/>
+      <w:numFmt w:val="bullet"/>
+      <w:lvlText w:val=""/>
+      <w:lvlJc w:val="start"/>
+      <w:pPr>
+        <w:tabs>
+          <w:tab w:val="num" w:pos="5672"/>
+        </w:tabs>
+        <w:ind w:start="5672" w:hanging="283"/>
+      </w:pPr>
+      <w:rPr>
+        <w:rFonts w:ascii="Symbol" w:hAnsi="Symbol" w:cs="Symbol" w:hint="default"/>
+      </w:rPr>
+    </w:lvl>
+    <w:lvl w:ilvl="8">
+      <w:start w:val="1"/>
+      <w:numFmt w:val="bullet"/>
+      <w:lvlText w:val=""/>
+      <w:lvlJc w:val="start"/>
+      <w:pPr>
+        <w:tabs>
+          <w:tab w:val="num" w:pos="6381"/>
+        </w:tabs>
+        <w:ind w:start="6381" w:hanging="283"/>
+      </w:pPr>
+      <w:rPr>
+        <w:rFonts w:ascii="Symbol" w:hAnsi="Symbol" w:cs="Symbol" w:hint="default"/>
+      </w:rPr>
+    </w:lvl>
+  </w:abstractNum>
+  <w:abstractNum w:abstractNumId="34">
     <w:lvl w:ilvl="0">
       <w:start w:val="1"/>
       <w:numFmt w:val="none"/>
@@ -20989,6 +21448,9 @@
   </w:num>
   <w:num w:numId="33">
     <w:abstractNumId w:val="33"/>
+  </w:num>
+  <w:num w:numId="34">
+    <w:abstractNumId w:val="34"/>
   </w:num>
 </w:numbering>
 </file>

</xml_diff>